<commit_message>
Update Module File for Version 13.3
Added the latest module file for Version 13.3 module, which includes a try/except statement to pre-empt a future change to scipy.
</commit_message>
<xml_diff>
--- a/Cyclone Tracking Description - Version 13.2.docx
+++ b/Cyclone Tracking Description - Version 13.2.docx
@@ -1,6 +1,6 @@
 
 <file path=word/document.xml><?xml version="1.0" encoding="utf-8"?>
-<w:document xmlns:wpc="http://schemas.microsoft.com/office/word/2010/wordprocessingCanvas" xmlns:cx="http://schemas.microsoft.com/office/drawing/2014/chartex" xmlns:cx1="http://schemas.microsoft.com/office/drawing/2015/9/8/chartex" xmlns:cx2="http://schemas.microsoft.com/office/drawing/2015/10/21/chartex" xmlns:cx3="http://schemas.microsoft.com/office/drawing/2016/5/9/chartex" xmlns:cx4="http://schemas.microsoft.com/office/drawing/2016/5/10/chartex" xmlns:cx5="http://schemas.microsoft.com/office/drawing/2016/5/11/chartex" xmlns:cx6="http://schemas.microsoft.com/office/drawing/2016/5/12/chartex" xmlns:cx7="http://schemas.microsoft.com/office/drawing/2016/5/13/chartex" xmlns:cx8="http://schemas.microsoft.com/office/drawing/2016/5/14/chartex" xmlns:mc="http://schemas.openxmlformats.org/markup-compatibility/2006" xmlns:aink="http://schemas.microsoft.com/office/drawing/2016/ink" xmlns:am3d="http://schemas.microsoft.com/office/drawing/2017/model3d" xmlns:o="urn:schemas-microsoft-com:office:office" xmlns:oel="http://schemas.microsoft.com/office/2019/extlst" xmlns:r="http://schemas.openxmlformats.org/officeDocument/2006/relationships" xmlns:m="http://schemas.openxmlformats.org/officeDocument/2006/math" xmlns:v="urn:schemas-microsoft-com:vml" xmlns:wp14="http://schemas.microsoft.com/office/word/2010/wordprocessingDrawing" xmlns:wp="http://schemas.openxmlformats.org/drawingml/2006/wordprocessingDrawing" xmlns:w10="urn:schemas-microsoft-com:office:word" xmlns:w="http://schemas.openxmlformats.org/wordprocessingml/2006/main" xmlns:w14="http://schemas.microsoft.com/office/word/2010/wordml" xmlns:w15="http://schemas.microsoft.com/office/word/2012/wordml" xmlns:w16cex="http://schemas.microsoft.com/office/word/2018/wordml/cex" xmlns:w16cid="http://schemas.microsoft.com/office/word/2016/wordml/cid" xmlns:w16="http://schemas.microsoft.com/office/word/2018/wordml" xmlns:w16sdtdh="http://schemas.microsoft.com/office/word/2020/wordml/sdtdatahash" xmlns:w16se="http://schemas.microsoft.com/office/word/2015/wordml/symex" xmlns:wpg="http://schemas.microsoft.com/office/word/2010/wordprocessingGroup" xmlns:wpi="http://schemas.microsoft.com/office/word/2010/wordprocessingInk" xmlns:wne="http://schemas.microsoft.com/office/word/2006/wordml" xmlns:wps="http://schemas.microsoft.com/office/word/2010/wordprocessingShape" mc:Ignorable="w14 w15 w16se w16cid w16 w16cex w16sdtdh wp14">
+<w:document xmlns:wpc="http://schemas.microsoft.com/office/word/2010/wordprocessingCanvas" xmlns:cx="http://schemas.microsoft.com/office/drawing/2014/chartex" xmlns:cx1="http://schemas.microsoft.com/office/drawing/2015/9/8/chartex" xmlns:cx2="http://schemas.microsoft.com/office/drawing/2015/10/21/chartex" xmlns:cx3="http://schemas.microsoft.com/office/drawing/2016/5/9/chartex" xmlns:cx4="http://schemas.microsoft.com/office/drawing/2016/5/10/chartex" xmlns:cx5="http://schemas.microsoft.com/office/drawing/2016/5/11/chartex" xmlns:cx6="http://schemas.microsoft.com/office/drawing/2016/5/12/chartex" xmlns:cx7="http://schemas.microsoft.com/office/drawing/2016/5/13/chartex" xmlns:cx8="http://schemas.microsoft.com/office/drawing/2016/5/14/chartex" xmlns:mc="http://schemas.openxmlformats.org/markup-compatibility/2006" xmlns:aink="http://schemas.microsoft.com/office/drawing/2016/ink" xmlns:am3d="http://schemas.microsoft.com/office/drawing/2017/model3d" xmlns:o="urn:schemas-microsoft-com:office:office" xmlns:oel="http://schemas.microsoft.com/office/2019/extlst" xmlns:r="http://schemas.openxmlformats.org/officeDocument/2006/relationships" xmlns:m="http://schemas.openxmlformats.org/officeDocument/2006/math" xmlns:v="urn:schemas-microsoft-com:vml" xmlns:wp14="http://schemas.microsoft.com/office/word/2010/wordprocessingDrawing" xmlns:wp="http://schemas.openxmlformats.org/drawingml/2006/wordprocessingDrawing" xmlns:w10="urn:schemas-microsoft-com:office:word" xmlns:w="http://schemas.openxmlformats.org/wordprocessingml/2006/main" xmlns:w14="http://schemas.microsoft.com/office/word/2010/wordml" xmlns:w15="http://schemas.microsoft.com/office/word/2012/wordml" xmlns:w16cex="http://schemas.microsoft.com/office/word/2018/wordml/cex" xmlns:w16cid="http://schemas.microsoft.com/office/word/2016/wordml/cid" xmlns:w16="http://schemas.microsoft.com/office/word/2018/wordml" xmlns:w16du="http://schemas.microsoft.com/office/word/2023/wordml/word16du" xmlns:w16sdtdh="http://schemas.microsoft.com/office/word/2020/wordml/sdtdatahash" xmlns:w16se="http://schemas.microsoft.com/office/word/2015/wordml/symex" xmlns:wpg="http://schemas.microsoft.com/office/word/2010/wordprocessingGroup" xmlns:wpi="http://schemas.microsoft.com/office/word/2010/wordprocessingInk" xmlns:wne="http://schemas.microsoft.com/office/word/2006/wordml" xmlns:wps="http://schemas.microsoft.com/office/word/2010/wordprocessingShape" mc:Ignorable="w14 w15 w16se w16cid w16 w16cex w16sdtdh w16du wp14">
   <w:body>
     <w:p>
       <w:pPr>
@@ -560,6 +560,7 @@
                 <w:szCs w:val="22"/>
               </w:rPr>
             </w:pPr>
+            <w:proofErr w:type="spellStart"/>
             <w:r>
               <w:rPr>
                 <w:rFonts w:ascii="Calibri" w:hAnsi="Calibri" w:cs="Calibri"/>
@@ -576,6 +577,7 @@
               </w:rPr>
               <w:t>km</w:t>
             </w:r>
+            <w:proofErr w:type="spellEnd"/>
           </w:p>
         </w:tc>
         <w:tc>
@@ -660,6 +662,7 @@
               </w:rPr>
               <w:t>“</w:t>
             </w:r>
+            <w:proofErr w:type="spellStart"/>
             <w:r>
               <w:rPr>
                 <w:rFonts w:ascii="Calibri" w:hAnsi="Calibri" w:cs="Calibri"/>
@@ -668,6 +671,7 @@
               </w:rPr>
               <w:t>kSizekm</w:t>
             </w:r>
+            <w:proofErr w:type="spellEnd"/>
             <w:r>
               <w:rPr>
                 <w:rFonts w:ascii="Calibri" w:hAnsi="Calibri" w:cs="Calibri"/>
@@ -731,6 +735,7 @@
                 <w:szCs w:val="22"/>
               </w:rPr>
             </w:pPr>
+            <w:proofErr w:type="spellStart"/>
             <w:r>
               <w:rPr>
                 <w:rFonts w:ascii="Calibri" w:hAnsi="Calibri" w:cs="Calibri"/>
@@ -739,6 +744,7 @@
               </w:rPr>
               <w:t>nanThresh</w:t>
             </w:r>
+            <w:proofErr w:type="spellEnd"/>
           </w:p>
         </w:tc>
         <w:tc>
@@ -832,14 +838,34 @@
                 <w:szCs w:val="22"/>
               </w:rPr>
             </w:pPr>
-            <w:r>
-              <w:rPr>
-                <w:rFonts w:ascii="Calibri" w:hAnsi="Calibri" w:cs="Calibri"/>
-                <w:sz w:val="22"/>
-                <w:szCs w:val="22"/>
-              </w:rPr>
-              <w:t>d_slp / d_dist</w:t>
-            </w:r>
+            <w:proofErr w:type="spellStart"/>
+            <w:r>
+              <w:rPr>
+                <w:rFonts w:ascii="Calibri" w:hAnsi="Calibri" w:cs="Calibri"/>
+                <w:sz w:val="22"/>
+                <w:szCs w:val="22"/>
+              </w:rPr>
+              <w:t>d_slp</w:t>
+            </w:r>
+            <w:proofErr w:type="spellEnd"/>
+            <w:r>
+              <w:rPr>
+                <w:rFonts w:ascii="Calibri" w:hAnsi="Calibri" w:cs="Calibri"/>
+                <w:sz w:val="22"/>
+                <w:szCs w:val="22"/>
+              </w:rPr>
+              <w:t xml:space="preserve"> / </w:t>
+            </w:r>
+            <w:proofErr w:type="spellStart"/>
+            <w:r>
+              <w:rPr>
+                <w:rFonts w:ascii="Calibri" w:hAnsi="Calibri" w:cs="Calibri"/>
+                <w:sz w:val="22"/>
+                <w:szCs w:val="22"/>
+              </w:rPr>
+              <w:t>d_dist</w:t>
+            </w:r>
+            <w:proofErr w:type="spellEnd"/>
           </w:p>
         </w:tc>
         <w:tc>
@@ -954,6 +980,7 @@
                 <w:szCs w:val="22"/>
               </w:rPr>
             </w:pPr>
+            <w:proofErr w:type="spellStart"/>
             <w:r>
               <w:rPr>
                 <w:rFonts w:ascii="Calibri" w:hAnsi="Calibri" w:cs="Calibri"/>
@@ -970,6 +997,7 @@
               </w:rPr>
               <w:t>lev</w:t>
             </w:r>
+            <w:proofErr w:type="spellEnd"/>
           </w:p>
         </w:tc>
         <w:tc>
@@ -1055,6 +1083,7 @@
                 <w:szCs w:val="22"/>
               </w:rPr>
             </w:pPr>
+            <w:proofErr w:type="spellStart"/>
             <w:r>
               <w:rPr>
                 <w:rFonts w:ascii="Calibri" w:hAnsi="Calibri" w:cs="Calibri"/>
@@ -1063,6 +1092,7 @@
               </w:rPr>
               <w:t>contint</w:t>
             </w:r>
+            <w:proofErr w:type="spellEnd"/>
           </w:p>
         </w:tc>
         <w:tc>
@@ -1148,6 +1178,7 @@
                 <w:szCs w:val="22"/>
               </w:rPr>
             </w:pPr>
+            <w:proofErr w:type="spellStart"/>
             <w:r>
               <w:rPr>
                 <w:rFonts w:ascii="Calibri" w:hAnsi="Calibri" w:cs="Calibri"/>
@@ -1156,6 +1187,7 @@
               </w:rPr>
               <w:t>mcctol</w:t>
             </w:r>
+            <w:proofErr w:type="spellEnd"/>
           </w:p>
         </w:tc>
         <w:tc>
@@ -1241,6 +1273,7 @@
                 <w:szCs w:val="22"/>
               </w:rPr>
             </w:pPr>
+            <w:proofErr w:type="spellStart"/>
             <w:r>
               <w:rPr>
                 <w:rFonts w:ascii="Calibri" w:hAnsi="Calibri" w:cs="Calibri"/>
@@ -1249,6 +1282,7 @@
               </w:rPr>
               <w:t>mccdist</w:t>
             </w:r>
+            <w:proofErr w:type="spellEnd"/>
           </w:p>
         </w:tc>
         <w:tc>
@@ -1350,6 +1384,7 @@
                 <w:szCs w:val="22"/>
               </w:rPr>
             </w:pPr>
+            <w:proofErr w:type="spellStart"/>
             <w:r>
               <w:rPr>
                 <w:rFonts w:ascii="Calibri" w:hAnsi="Calibri" w:cs="Calibri"/>
@@ -1358,6 +1393,7 @@
               </w:rPr>
               <w:t>maxSpeed</w:t>
             </w:r>
+            <w:proofErr w:type="spellEnd"/>
           </w:p>
         </w:tc>
         <w:tc>
@@ -1518,7 +1554,25 @@
                 <w:sz w:val="22"/>
                 <w:szCs w:val="22"/>
               </w:rPr>
-              <w:t>Modifies the projection of a cyclone center’s propagation between two time steps, accounting for the tendency for cyclone propagation to slow with age</w:t>
+              <w:t xml:space="preserve">Modifies the projection of a cyclone center’s propagation between </w:t>
+            </w:r>
+            <w:proofErr w:type="gramStart"/>
+            <w:r>
+              <w:rPr>
+                <w:rFonts w:ascii="Calibri" w:hAnsi="Calibri" w:cs="Calibri"/>
+                <w:sz w:val="22"/>
+                <w:szCs w:val="22"/>
+              </w:rPr>
+              <w:t>two time</w:t>
+            </w:r>
+            <w:proofErr w:type="gramEnd"/>
+            <w:r>
+              <w:rPr>
+                <w:rFonts w:ascii="Calibri" w:hAnsi="Calibri" w:cs="Calibri"/>
+                <w:sz w:val="22"/>
+                <w:szCs w:val="22"/>
+              </w:rPr>
+              <w:t xml:space="preserve"> steps, accounting for the tendency for cyclone propagation to slow with age</w:t>
             </w:r>
           </w:p>
         </w:tc>
@@ -1595,13 +1649,41 @@
         <w:rPr>
           <w:rFonts w:ascii="Calibri" w:hAnsi="Calibri" w:cs="Calibri"/>
         </w:rPr>
-        <w:t>Any format that can be read as a numpy array will do</w:t>
-      </w:r>
-      <w:r>
-        <w:rPr>
-          <w:rFonts w:ascii="Calibri" w:hAnsi="Calibri" w:cs="Calibri"/>
-        </w:rPr>
-        <w:t>, but the code shared here is set up for netcdf files.</w:t>
+        <w:t xml:space="preserve">Any format that can be read as a </w:t>
+      </w:r>
+      <w:proofErr w:type="spellStart"/>
+      <w:r>
+        <w:rPr>
+          <w:rFonts w:ascii="Calibri" w:hAnsi="Calibri" w:cs="Calibri"/>
+        </w:rPr>
+        <w:t>numpy</w:t>
+      </w:r>
+      <w:proofErr w:type="spellEnd"/>
+      <w:r>
+        <w:rPr>
+          <w:rFonts w:ascii="Calibri" w:hAnsi="Calibri" w:cs="Calibri"/>
+        </w:rPr>
+        <w:t xml:space="preserve"> array will do</w:t>
+      </w:r>
+      <w:r>
+        <w:rPr>
+          <w:rFonts w:ascii="Calibri" w:hAnsi="Calibri" w:cs="Calibri"/>
+        </w:rPr>
+        <w:t xml:space="preserve">, but the code shared here is set up for </w:t>
+      </w:r>
+      <w:proofErr w:type="spellStart"/>
+      <w:r>
+        <w:rPr>
+          <w:rFonts w:ascii="Calibri" w:hAnsi="Calibri" w:cs="Calibri"/>
+        </w:rPr>
+        <w:t>netcdf</w:t>
+      </w:r>
+      <w:proofErr w:type="spellEnd"/>
+      <w:r>
+        <w:rPr>
+          <w:rFonts w:ascii="Calibri" w:hAnsi="Calibri" w:cs="Calibri"/>
+        </w:rPr>
+        <w:t xml:space="preserve"> files.</w:t>
       </w:r>
     </w:p>
     <w:p>
@@ -1646,7 +1728,21 @@
         <w:rPr>
           <w:rFonts w:ascii="Calibri" w:hAnsi="Calibri" w:cs="Calibri"/>
         </w:rPr>
-        <w:t xml:space="preserve"> of the same projection, grid cell size, and extent as the SLP inputs. Any format that can be read as a numpy array will do.</w:t>
+        <w:t xml:space="preserve"> of the same projection, grid cell size, and extent as the SLP inputs. Any format that can be read as a </w:t>
+      </w:r>
+      <w:proofErr w:type="spellStart"/>
+      <w:r>
+        <w:rPr>
+          <w:rFonts w:ascii="Calibri" w:hAnsi="Calibri" w:cs="Calibri"/>
+        </w:rPr>
+        <w:t>numpy</w:t>
+      </w:r>
+      <w:proofErr w:type="spellEnd"/>
+      <w:r>
+        <w:rPr>
+          <w:rFonts w:ascii="Calibri" w:hAnsi="Calibri" w:cs="Calibri"/>
+        </w:rPr>
+        <w:t xml:space="preserve"> array will do.</w:t>
       </w:r>
       <w:r>
         <w:rPr>
@@ -1673,7 +1769,21 @@
         <w:rPr>
           <w:rFonts w:ascii="Calibri" w:hAnsi="Calibri" w:cs="Calibri"/>
         </w:rPr>
-        <w:t>, I’ve loaded netcdf files with projection criteria for three resolutions: 100 km (180 by 180), 50 km (360 by 360), and 25 km (720 by 720).</w:t>
+        <w:t xml:space="preserve">, I’ve loaded </w:t>
+      </w:r>
+      <w:proofErr w:type="spellStart"/>
+      <w:r>
+        <w:rPr>
+          <w:rFonts w:ascii="Calibri" w:hAnsi="Calibri" w:cs="Calibri"/>
+        </w:rPr>
+        <w:t>netcdf</w:t>
+      </w:r>
+      <w:proofErr w:type="spellEnd"/>
+      <w:r>
+        <w:rPr>
+          <w:rFonts w:ascii="Calibri" w:hAnsi="Calibri" w:cs="Calibri"/>
+        </w:rPr>
+        <w:t xml:space="preserve"> files with projection criteria for three resolutions: 100 km (180 by 180), 50 km (360 by 360), and 25 km (720 by 720).</w:t>
       </w:r>
     </w:p>
     <w:p>
@@ -1694,7 +1804,35 @@
         <w:rPr>
           <w:rFonts w:ascii="Calibri" w:hAnsi="Calibri" w:cs="Calibri"/>
         </w:rPr>
-        <w:t xml:space="preserve"> (e.g. ~/opt/anaconda3/envs/myenv/lib/python3.8/site-packages)</w:t>
+        <w:t xml:space="preserve"> (e.g. ~/opt/anaconda3/</w:t>
+      </w:r>
+      <w:proofErr w:type="spellStart"/>
+      <w:r>
+        <w:rPr>
+          <w:rFonts w:ascii="Calibri" w:hAnsi="Calibri" w:cs="Calibri"/>
+        </w:rPr>
+        <w:t>envs</w:t>
+      </w:r>
+      <w:proofErr w:type="spellEnd"/>
+      <w:r>
+        <w:rPr>
+          <w:rFonts w:ascii="Calibri" w:hAnsi="Calibri" w:cs="Calibri"/>
+        </w:rPr>
+        <w:t>/</w:t>
+      </w:r>
+      <w:proofErr w:type="spellStart"/>
+      <w:r>
+        <w:rPr>
+          <w:rFonts w:ascii="Calibri" w:hAnsi="Calibri" w:cs="Calibri"/>
+        </w:rPr>
+        <w:t>myenv</w:t>
+      </w:r>
+      <w:proofErr w:type="spellEnd"/>
+      <w:r>
+        <w:rPr>
+          <w:rFonts w:ascii="Calibri" w:hAnsi="Calibri" w:cs="Calibri"/>
+        </w:rPr>
+        <w:t>/lib/python3.8/site-packages)</w:t>
       </w:r>
       <w:r>
         <w:rPr>
@@ -1783,11 +1921,19 @@
           <w:rFonts w:ascii="Calibri" w:hAnsi="Calibri" w:cs="Calibri"/>
         </w:rPr>
       </w:pPr>
-      <w:r>
-        <w:rPr>
-          <w:rFonts w:ascii="Calibri" w:hAnsi="Calibri" w:cs="Calibri"/>
-        </w:rPr>
-        <w:t>xesmf 0.5.1 (reprojection only – install this first)</w:t>
+      <w:proofErr w:type="spellStart"/>
+      <w:r>
+        <w:rPr>
+          <w:rFonts w:ascii="Calibri" w:hAnsi="Calibri" w:cs="Calibri"/>
+        </w:rPr>
+        <w:t>xesmf</w:t>
+      </w:r>
+      <w:proofErr w:type="spellEnd"/>
+      <w:r>
+        <w:rPr>
+          <w:rFonts w:ascii="Calibri" w:hAnsi="Calibri" w:cs="Calibri"/>
+        </w:rPr>
+        <w:t xml:space="preserve"> 0.5.1 (reprojection only – install this first)</w:t>
       </w:r>
     </w:p>
     <w:p>
@@ -1831,7 +1977,21 @@
         <w:rPr>
           <w:rFonts w:ascii="Calibri" w:hAnsi="Calibri" w:cs="Calibri"/>
         </w:rPr>
-        <w:t xml:space="preserve"> be installed with xesmf)</w:t>
+        <w:t xml:space="preserve"> be installed with </w:t>
+      </w:r>
+      <w:proofErr w:type="spellStart"/>
+      <w:r>
+        <w:rPr>
+          <w:rFonts w:ascii="Calibri" w:hAnsi="Calibri" w:cs="Calibri"/>
+        </w:rPr>
+        <w:t>xesmf</w:t>
+      </w:r>
+      <w:proofErr w:type="spellEnd"/>
+      <w:r>
+        <w:rPr>
+          <w:rFonts w:ascii="Calibri" w:hAnsi="Calibri" w:cs="Calibri"/>
+        </w:rPr>
+        <w:t>)</w:t>
       </w:r>
     </w:p>
     <w:p>
@@ -1862,7 +2022,20 @@
           <w:rFonts w:ascii="Calibri" w:hAnsi="Calibri" w:cs="Calibri"/>
         </w:rPr>
         <w:tab/>
-        <w:t>numpy 1.20.0</w:t>
+      </w:r>
+      <w:proofErr w:type="spellStart"/>
+      <w:r>
+        <w:rPr>
+          <w:rFonts w:ascii="Calibri" w:hAnsi="Calibri" w:cs="Calibri"/>
+        </w:rPr>
+        <w:t>numpy</w:t>
+      </w:r>
+      <w:proofErr w:type="spellEnd"/>
+      <w:r>
+        <w:rPr>
+          <w:rFonts w:ascii="Calibri" w:hAnsi="Calibri" w:cs="Calibri"/>
+        </w:rPr>
+        <w:t xml:space="preserve"> 1.20.0</w:t>
       </w:r>
     </w:p>
     <w:p>
@@ -1878,7 +2051,20 @@
           <w:rFonts w:ascii="Calibri" w:hAnsi="Calibri" w:cs="Calibri"/>
         </w:rPr>
         <w:tab/>
-        <w:t>scipy 1.4.1</w:t>
+      </w:r>
+      <w:proofErr w:type="spellStart"/>
+      <w:r>
+        <w:rPr>
+          <w:rFonts w:ascii="Calibri" w:hAnsi="Calibri" w:cs="Calibri"/>
+        </w:rPr>
+        <w:t>scipy</w:t>
+      </w:r>
+      <w:proofErr w:type="spellEnd"/>
+      <w:r>
+        <w:rPr>
+          <w:rFonts w:ascii="Calibri" w:hAnsi="Calibri" w:cs="Calibri"/>
+        </w:rPr>
+        <w:t xml:space="preserve"> 1.4.1</w:t>
       </w:r>
     </w:p>
     <w:p>
@@ -2088,7 +2274,21 @@
         <w:rPr>
           <w:rFonts w:ascii="Calibri" w:hAnsi="Calibri" w:cs="Calibri"/>
         </w:rPr>
-        <w:t>The main updates from version 12.4 to 13.2 involve the outputs up the main data frame in the cyclonetrack objects. Namely,</w:t>
+        <w:t xml:space="preserve">The main updates from version 12.4 to 13.2 involve the outputs up the main data frame in the </w:t>
+      </w:r>
+      <w:proofErr w:type="spellStart"/>
+      <w:r>
+        <w:rPr>
+          <w:rFonts w:ascii="Calibri" w:hAnsi="Calibri" w:cs="Calibri"/>
+        </w:rPr>
+        <w:t>cyclonetrack</w:t>
+      </w:r>
+      <w:proofErr w:type="spellEnd"/>
+      <w:r>
+        <w:rPr>
+          <w:rFonts w:ascii="Calibri" w:hAnsi="Calibri" w:cs="Calibri"/>
+        </w:rPr>
+        <w:t xml:space="preserve"> objects. Namely,</w:t>
       </w:r>
     </w:p>
     <w:p>
@@ -2184,7 +2384,21 @@
         <w:rPr>
           <w:rFonts w:ascii="Calibri" w:hAnsi="Calibri" w:cs="Calibri"/>
         </w:rPr>
-        <w:t xml:space="preserve">(p_grad) </w:t>
+        <w:t>(</w:t>
+      </w:r>
+      <w:proofErr w:type="spellStart"/>
+      <w:r>
+        <w:rPr>
+          <w:rFonts w:ascii="Calibri" w:hAnsi="Calibri" w:cs="Calibri"/>
+        </w:rPr>
+        <w:t>p_grad</w:t>
+      </w:r>
+      <w:proofErr w:type="spellEnd"/>
+      <w:r>
+        <w:rPr>
+          <w:rFonts w:ascii="Calibri" w:hAnsi="Calibri" w:cs="Calibri"/>
+        </w:rPr>
+        <w:t xml:space="preserve">) </w:t>
       </w:r>
       <w:r>
         <w:rPr>
@@ -2214,7 +2428,21 @@
         <w:rPr>
           <w:rFonts w:ascii="Calibri" w:hAnsi="Calibri" w:cs="Calibri"/>
         </w:rPr>
-        <w:t>Replaced all "longs" with "lons" when referring to longitude</w:t>
+        <w:t>Replaced all "longs" with "</w:t>
+      </w:r>
+      <w:proofErr w:type="spellStart"/>
+      <w:r>
+        <w:rPr>
+          <w:rFonts w:ascii="Calibri" w:hAnsi="Calibri" w:cs="Calibri"/>
+        </w:rPr>
+        <w:t>lons</w:t>
+      </w:r>
+      <w:proofErr w:type="spellEnd"/>
+      <w:r>
+        <w:rPr>
+          <w:rFonts w:ascii="Calibri" w:hAnsi="Calibri" w:cs="Calibri"/>
+        </w:rPr>
+        <w:t>" when referring to longitude</w:t>
       </w:r>
       <w:r>
         <w:rPr>
@@ -2256,7 +2484,35 @@
         <w:rPr>
           <w:rFonts w:ascii="Calibri" w:hAnsi="Calibri" w:cs="Calibri"/>
         </w:rPr>
-        <w:t xml:space="preserve">Added a try/except statement to cTrack2sTrack function so that it will ignore cases where tids between two months don’t align instead of breaking. Such cases lead to there being two separate system tracks despite a regenesis event being detected. This is a fringe case that probably effects fewer than one in </w:t>
+        <w:t xml:space="preserve">Added a try/except statement to cTrack2sTrack function so that it will ignore cases where </w:t>
+      </w:r>
+      <w:proofErr w:type="spellStart"/>
+      <w:r>
+        <w:rPr>
+          <w:rFonts w:ascii="Calibri" w:hAnsi="Calibri" w:cs="Calibri"/>
+        </w:rPr>
+        <w:t>tids</w:t>
+      </w:r>
+      <w:proofErr w:type="spellEnd"/>
+      <w:r>
+        <w:rPr>
+          <w:rFonts w:ascii="Calibri" w:hAnsi="Calibri" w:cs="Calibri"/>
+        </w:rPr>
+        <w:t xml:space="preserve"> between two months don’t align instead of breaking. Such cases lead to there being two separate system tracks despite a </w:t>
+      </w:r>
+      <w:proofErr w:type="spellStart"/>
+      <w:r>
+        <w:rPr>
+          <w:rFonts w:ascii="Calibri" w:hAnsi="Calibri" w:cs="Calibri"/>
+        </w:rPr>
+        <w:t>regenesis</w:t>
+      </w:r>
+      <w:proofErr w:type="spellEnd"/>
+      <w:r>
+        <w:rPr>
+          <w:rFonts w:ascii="Calibri" w:hAnsi="Calibri" w:cs="Calibri"/>
+        </w:rPr>
+        <w:t xml:space="preserve"> event being detected. This is a fringe case that probably effects fewer than one in </w:t>
       </w:r>
       <w:r>
         <w:rPr>
@@ -2267,14 +2523,6 @@
     </w:p>
     <w:p>
       <w:pPr>
-        <w:rPr>
-          <w:rFonts w:ascii="Calibri" w:hAnsi="Calibri" w:cs="Calibri"/>
-        </w:rPr>
-      </w:pPr>
-    </w:p>
-    <w:p>
-      <w:pPr>
-        <w:ind w:firstLine="720"/>
         <w:contextualSpacing/>
         <w:rPr>
           <w:rFonts w:ascii="Calibri" w:hAnsi="Calibri" w:cs="Calibri"/>
@@ -2286,6 +2534,7 @@
         <w:pStyle w:val="Heading1"/>
       </w:pPr>
       <w:r>
+        <w:lastRenderedPageBreak/>
         <w:t>3</w:t>
       </w:r>
       <w:r>
@@ -2310,7 +2559,13 @@
         <w:rPr>
           <w:rFonts w:ascii="Calibri" w:hAnsi="Calibri" w:cs="Calibri"/>
         </w:rPr>
-        <w:t xml:space="preserve">The output from this algorithm is two-fold.  First, the synoptic information for each SLP field is stored in a customized cyclone field object, which is readable in Python. These objects contain information regarding cyclone location, area, </w:t>
+        <w:t>O</w:t>
+      </w:r>
+      <w:r>
+        <w:rPr>
+          <w:rFonts w:ascii="Calibri" w:hAnsi="Calibri" w:cs="Calibri"/>
+        </w:rPr>
+        <w:t xml:space="preserve">utput from this algorithm is two-fold.  First, synoptic information for each SLP field is stored in a customized cyclone field object, which is readable in Python. These objects contain information regarding cyclone location, area, </w:t>
       </w:r>
       <w:r>
         <w:rPr>
@@ -2381,6 +2636,7 @@
         </w:rPr>
         <w:t xml:space="preserve"> months are grouped with the month in which they experience </w:t>
       </w:r>
+      <w:proofErr w:type="spellStart"/>
       <w:r>
         <w:rPr>
           <w:rFonts w:ascii="Calibri" w:hAnsi="Calibri" w:cs="Calibri"/>
@@ -2391,7 +2647,14 @@
         <w:rPr>
           <w:rFonts w:ascii="Calibri" w:hAnsi="Calibri" w:cs="Calibri"/>
         </w:rPr>
-        <w:t xml:space="preserve">lysis.  </w:t>
+        <w:t>lysis</w:t>
+      </w:r>
+      <w:proofErr w:type="spellEnd"/>
+      <w:r>
+        <w:rPr>
+          <w:rFonts w:ascii="Calibri" w:hAnsi="Calibri" w:cs="Calibri"/>
+        </w:rPr>
+        <w:t xml:space="preserve">.  </w:t>
       </w:r>
     </w:p>
     <w:p>
@@ -2715,14 +2978,34 @@
                 <w:szCs w:val="22"/>
               </w:rPr>
             </w:pPr>
-            <w:r>
-              <w:rPr>
-                <w:rFonts w:ascii="Calibri" w:hAnsi="Calibri" w:cs="Calibri"/>
-                <w:sz w:val="22"/>
-                <w:szCs w:val="22"/>
-              </w:rPr>
-              <w:t>lon, lat</w:t>
-            </w:r>
+            <w:proofErr w:type="spellStart"/>
+            <w:r>
+              <w:rPr>
+                <w:rFonts w:ascii="Calibri" w:hAnsi="Calibri" w:cs="Calibri"/>
+                <w:sz w:val="22"/>
+                <w:szCs w:val="22"/>
+              </w:rPr>
+              <w:t>lon</w:t>
+            </w:r>
+            <w:proofErr w:type="spellEnd"/>
+            <w:r>
+              <w:rPr>
+                <w:rFonts w:ascii="Calibri" w:hAnsi="Calibri" w:cs="Calibri"/>
+                <w:sz w:val="22"/>
+                <w:szCs w:val="22"/>
+              </w:rPr>
+              <w:t xml:space="preserve">, </w:t>
+            </w:r>
+            <w:proofErr w:type="spellStart"/>
+            <w:r>
+              <w:rPr>
+                <w:rFonts w:ascii="Calibri" w:hAnsi="Calibri" w:cs="Calibri"/>
+                <w:sz w:val="22"/>
+                <w:szCs w:val="22"/>
+              </w:rPr>
+              <w:t>lat</w:t>
+            </w:r>
+            <w:proofErr w:type="spellEnd"/>
           </w:p>
         </w:tc>
         <w:tc>
@@ -2997,6 +3280,7 @@
                 <w:szCs w:val="22"/>
               </w:rPr>
             </w:pPr>
+            <w:proofErr w:type="spellStart"/>
             <w:r>
               <w:rPr>
                 <w:rFonts w:ascii="Calibri" w:hAnsi="Calibri" w:cs="Calibri"/>
@@ -3005,6 +3289,7 @@
               </w:rPr>
               <w:t>uv</w:t>
             </w:r>
+            <w:proofErr w:type="spellEnd"/>
           </w:p>
         </w:tc>
         <w:tc>
@@ -3225,6 +3510,7 @@
                 <w:szCs w:val="22"/>
               </w:rPr>
             </w:pPr>
+            <w:proofErr w:type="spellStart"/>
             <w:r>
               <w:rPr>
                 <w:rFonts w:ascii="Calibri" w:hAnsi="Calibri" w:cs="Calibri"/>
@@ -3233,6 +3519,7 @@
               </w:rPr>
               <w:t>pid</w:t>
             </w:r>
+            <w:proofErr w:type="spellEnd"/>
           </w:p>
         </w:tc>
         <w:tc>
@@ -3317,6 +3604,7 @@
                 <w:szCs w:val="22"/>
               </w:rPr>
             </w:pPr>
+            <w:proofErr w:type="spellStart"/>
             <w:r>
               <w:rPr>
                 <w:rFonts w:ascii="Calibri" w:hAnsi="Calibri" w:cs="Calibri"/>
@@ -3325,6 +3613,7 @@
               </w:rPr>
               <w:t>tid</w:t>
             </w:r>
+            <w:proofErr w:type="spellEnd"/>
           </w:p>
         </w:tc>
         <w:tc>
@@ -3409,6 +3698,7 @@
                 <w:szCs w:val="22"/>
               </w:rPr>
             </w:pPr>
+            <w:proofErr w:type="spellStart"/>
             <w:r>
               <w:rPr>
                 <w:rFonts w:ascii="Calibri" w:hAnsi="Calibri" w:cs="Calibri"/>
@@ -3417,6 +3707,7 @@
               </w:rPr>
               <w:t>ftid</w:t>
             </w:r>
+            <w:proofErr w:type="spellEnd"/>
           </w:p>
         </w:tc>
         <w:tc>
@@ -3501,6 +3792,7 @@
                 <w:szCs w:val="22"/>
               </w:rPr>
             </w:pPr>
+            <w:proofErr w:type="spellStart"/>
             <w:r>
               <w:rPr>
                 <w:rFonts w:ascii="Calibri" w:hAnsi="Calibri" w:cs="Calibri"/>
@@ -3509,6 +3801,7 @@
               </w:rPr>
               <w:t>ptid</w:t>
             </w:r>
+            <w:proofErr w:type="spellEnd"/>
           </w:p>
         </w:tc>
         <w:tc>
@@ -3568,7 +3861,25 @@
                 <w:sz w:val="22"/>
                 <w:szCs w:val="22"/>
               </w:rPr>
-              <w:t>Track ID of the primary center in a MCC</w:t>
+              <w:t xml:space="preserve">Track ID of the primary center in </w:t>
+            </w:r>
+            <w:proofErr w:type="gramStart"/>
+            <w:r>
+              <w:rPr>
+                <w:rFonts w:ascii="Calibri" w:hAnsi="Calibri" w:cs="Calibri"/>
+                <w:sz w:val="22"/>
+                <w:szCs w:val="22"/>
+              </w:rPr>
+              <w:t>a</w:t>
+            </w:r>
+            <w:proofErr w:type="gramEnd"/>
+            <w:r>
+              <w:rPr>
+                <w:rFonts w:ascii="Calibri" w:hAnsi="Calibri" w:cs="Calibri"/>
+                <w:sz w:val="22"/>
+                <w:szCs w:val="22"/>
+              </w:rPr>
+              <w:t xml:space="preserve"> MCC</w:t>
             </w:r>
           </w:p>
         </w:tc>
@@ -3592,6 +3903,7 @@
                 <w:szCs w:val="22"/>
               </w:rPr>
             </w:pPr>
+            <w:proofErr w:type="spellStart"/>
             <w:r>
               <w:rPr>
                 <w:rFonts w:ascii="Calibri" w:hAnsi="Calibri" w:cs="Calibri"/>
@@ -3600,6 +3912,7 @@
               </w:rPr>
               <w:t>sid</w:t>
             </w:r>
+            <w:proofErr w:type="spellEnd"/>
           </w:p>
         </w:tc>
         <w:tc>
@@ -3715,6 +4028,7 @@
                 <w:szCs w:val="22"/>
               </w:rPr>
             </w:pPr>
+            <w:proofErr w:type="spellStart"/>
             <w:r>
               <w:rPr>
                 <w:rFonts w:ascii="Calibri" w:hAnsi="Calibri" w:cs="Calibri"/>
@@ -3723,6 +4037,7 @@
               </w:rPr>
               <w:t>p_cent</w:t>
             </w:r>
+            <w:proofErr w:type="spellEnd"/>
           </w:p>
         </w:tc>
         <w:tc>
@@ -3805,6 +4120,7 @@
                 <w:szCs w:val="22"/>
               </w:rPr>
             </w:pPr>
+            <w:proofErr w:type="spellStart"/>
             <w:r>
               <w:rPr>
                 <w:rFonts w:ascii="Calibri" w:hAnsi="Calibri" w:cs="Calibri"/>
@@ -3813,6 +4129,7 @@
               </w:rPr>
               <w:t>p_edge</w:t>
             </w:r>
+            <w:proofErr w:type="spellEnd"/>
           </w:p>
         </w:tc>
         <w:tc>
@@ -4118,6 +4435,14 @@
               </w:rPr>
               <w:t>Radius of a circle with the same area as cyclone</w:t>
             </w:r>
+            <w:r>
+              <w:rPr>
+                <w:rFonts w:ascii="Calibri" w:hAnsi="Calibri" w:cs="Calibri"/>
+                <w:sz w:val="22"/>
+                <w:szCs w:val="22"/>
+              </w:rPr>
+              <w:t xml:space="preserve"> (“effective radius”)</w:t>
+            </w:r>
           </w:p>
         </w:tc>
       </w:tr>
@@ -4233,6 +4558,7 @@
                 <w:szCs w:val="22"/>
               </w:rPr>
             </w:pPr>
+            <w:proofErr w:type="spellStart"/>
             <w:r>
               <w:rPr>
                 <w:rFonts w:ascii="Calibri" w:hAnsi="Calibri" w:cs="Calibri"/>
@@ -4241,6 +4567,7 @@
               </w:rPr>
               <w:t>p_grad</w:t>
             </w:r>
+            <w:proofErr w:type="spellEnd"/>
           </w:p>
         </w:tc>
         <w:tc>
@@ -4333,6 +4660,7 @@
                 <w:szCs w:val="22"/>
               </w:rPr>
             </w:pPr>
+            <w:proofErr w:type="spellStart"/>
             <w:r>
               <w:rPr>
                 <w:rFonts w:ascii="Calibri" w:hAnsi="Calibri" w:cs="Calibri"/>
@@ -4341,6 +4669,7 @@
               </w:rPr>
               <w:t>DpDt</w:t>
             </w:r>
+            <w:proofErr w:type="spellEnd"/>
           </w:p>
         </w:tc>
         <w:tc>
@@ -4424,6 +4753,7 @@
                 <w:szCs w:val="22"/>
               </w:rPr>
             </w:pPr>
+            <w:proofErr w:type="spellStart"/>
             <w:r>
               <w:rPr>
                 <w:rFonts w:ascii="Calibri" w:hAnsi="Calibri" w:cs="Calibri"/>
@@ -4432,6 +4762,7 @@
               </w:rPr>
               <w:t>DsqP</w:t>
             </w:r>
+            <w:proofErr w:type="spellEnd"/>
           </w:p>
         </w:tc>
         <w:tc>
@@ -4672,7 +5003,25 @@
                 <w:sz w:val="22"/>
                 <w:szCs w:val="22"/>
               </w:rPr>
-              <w:t>1 = primary center, 2 = secondary center (in a MCC), 0 = this row is only present for calculating propagation (used during splits, merges, and lysis events)</w:t>
+              <w:t xml:space="preserve">1 = primary center, 2 = secondary center (in </w:t>
+            </w:r>
+            <w:proofErr w:type="gramStart"/>
+            <w:r>
+              <w:rPr>
+                <w:rFonts w:ascii="Calibri" w:hAnsi="Calibri" w:cs="Calibri"/>
+                <w:sz w:val="22"/>
+                <w:szCs w:val="22"/>
+              </w:rPr>
+              <w:t>a</w:t>
+            </w:r>
+            <w:proofErr w:type="gramEnd"/>
+            <w:r>
+              <w:rPr>
+                <w:rFonts w:ascii="Calibri" w:hAnsi="Calibri" w:cs="Calibri"/>
+                <w:sz w:val="22"/>
+                <w:szCs w:val="22"/>
+              </w:rPr>
+              <w:t xml:space="preserve"> MCC), 0 = this row is only present for calculating propagation (used during splits, merges, and lysis events)</w:t>
             </w:r>
           </w:p>
         </w:tc>
@@ -4880,14 +5229,41 @@
                 <w:szCs w:val="22"/>
               </w:rPr>
             </w:pPr>
-            <w:r>
-              <w:rPr>
-                <w:rFonts w:ascii="Calibri" w:hAnsi="Calibri" w:cs="Calibri"/>
-                <w:sz w:val="22"/>
-                <w:szCs w:val="22"/>
-              </w:rPr>
-              <w:lastRenderedPageBreak/>
-              <w:t>Ege, Ely, Emg, Esp, Erg</w:t>
+            <w:proofErr w:type="spellStart"/>
+            <w:r>
+              <w:rPr>
+                <w:rFonts w:ascii="Calibri" w:hAnsi="Calibri" w:cs="Calibri"/>
+                <w:sz w:val="22"/>
+                <w:szCs w:val="22"/>
+              </w:rPr>
+              <w:t>Ege</w:t>
+            </w:r>
+            <w:proofErr w:type="spellEnd"/>
+            <w:r>
+              <w:rPr>
+                <w:rFonts w:ascii="Calibri" w:hAnsi="Calibri" w:cs="Calibri"/>
+                <w:sz w:val="22"/>
+                <w:szCs w:val="22"/>
+              </w:rPr>
+              <w:t xml:space="preserve">, Ely, </w:t>
+            </w:r>
+            <w:proofErr w:type="spellStart"/>
+            <w:r>
+              <w:rPr>
+                <w:rFonts w:ascii="Calibri" w:hAnsi="Calibri" w:cs="Calibri"/>
+                <w:sz w:val="22"/>
+                <w:szCs w:val="22"/>
+              </w:rPr>
+              <w:t>Emg</w:t>
+            </w:r>
+            <w:proofErr w:type="spellEnd"/>
+            <w:r>
+              <w:rPr>
+                <w:rFonts w:ascii="Calibri" w:hAnsi="Calibri" w:cs="Calibri"/>
+                <w:sz w:val="22"/>
+                <w:szCs w:val="22"/>
+              </w:rPr>
+              <w:t>, Esp, Erg</w:t>
             </w:r>
           </w:p>
         </w:tc>
@@ -4946,7 +5322,97 @@
                 <w:sz w:val="22"/>
                 <w:szCs w:val="22"/>
               </w:rPr>
-              <w:t>Records whether the cyclone experienced genesis (ge), lysis (ly), merging (mg), splitting (sp), or regenesis (rg); 0 = no event, 1 = center-only, 2 = area-only, 3 = both center and area involved in event</w:t>
+              <w:t>Records whether the cyclone experienced genesis (</w:t>
+            </w:r>
+            <w:proofErr w:type="spellStart"/>
+            <w:r>
+              <w:rPr>
+                <w:rFonts w:ascii="Calibri" w:hAnsi="Calibri" w:cs="Calibri"/>
+                <w:sz w:val="22"/>
+                <w:szCs w:val="22"/>
+              </w:rPr>
+              <w:t>ge</w:t>
+            </w:r>
+            <w:proofErr w:type="spellEnd"/>
+            <w:r>
+              <w:rPr>
+                <w:rFonts w:ascii="Calibri" w:hAnsi="Calibri" w:cs="Calibri"/>
+                <w:sz w:val="22"/>
+                <w:szCs w:val="22"/>
+              </w:rPr>
+              <w:t>), lysis (</w:t>
+            </w:r>
+            <w:proofErr w:type="spellStart"/>
+            <w:r>
+              <w:rPr>
+                <w:rFonts w:ascii="Calibri" w:hAnsi="Calibri" w:cs="Calibri"/>
+                <w:sz w:val="22"/>
+                <w:szCs w:val="22"/>
+              </w:rPr>
+              <w:t>ly</w:t>
+            </w:r>
+            <w:proofErr w:type="spellEnd"/>
+            <w:r>
+              <w:rPr>
+                <w:rFonts w:ascii="Calibri" w:hAnsi="Calibri" w:cs="Calibri"/>
+                <w:sz w:val="22"/>
+                <w:szCs w:val="22"/>
+              </w:rPr>
+              <w:t>), merging (mg), splitting (</w:t>
+            </w:r>
+            <w:proofErr w:type="spellStart"/>
+            <w:r>
+              <w:rPr>
+                <w:rFonts w:ascii="Calibri" w:hAnsi="Calibri" w:cs="Calibri"/>
+                <w:sz w:val="22"/>
+                <w:szCs w:val="22"/>
+              </w:rPr>
+              <w:t>sp</w:t>
+            </w:r>
+            <w:proofErr w:type="spellEnd"/>
+            <w:r>
+              <w:rPr>
+                <w:rFonts w:ascii="Calibri" w:hAnsi="Calibri" w:cs="Calibri"/>
+                <w:sz w:val="22"/>
+                <w:szCs w:val="22"/>
+              </w:rPr>
+              <w:t xml:space="preserve">), or </w:t>
+            </w:r>
+            <w:proofErr w:type="spellStart"/>
+            <w:r>
+              <w:rPr>
+                <w:rFonts w:ascii="Calibri" w:hAnsi="Calibri" w:cs="Calibri"/>
+                <w:sz w:val="22"/>
+                <w:szCs w:val="22"/>
+              </w:rPr>
+              <w:t>regenesis</w:t>
+            </w:r>
+            <w:proofErr w:type="spellEnd"/>
+            <w:r>
+              <w:rPr>
+                <w:rFonts w:ascii="Calibri" w:hAnsi="Calibri" w:cs="Calibri"/>
+                <w:sz w:val="22"/>
+                <w:szCs w:val="22"/>
+              </w:rPr>
+              <w:t xml:space="preserve"> (</w:t>
+            </w:r>
+            <w:proofErr w:type="spellStart"/>
+            <w:r>
+              <w:rPr>
+                <w:rFonts w:ascii="Calibri" w:hAnsi="Calibri" w:cs="Calibri"/>
+                <w:sz w:val="22"/>
+                <w:szCs w:val="22"/>
+              </w:rPr>
+              <w:t>rg</w:t>
+            </w:r>
+            <w:proofErr w:type="spellEnd"/>
+            <w:r>
+              <w:rPr>
+                <w:rFonts w:ascii="Calibri" w:hAnsi="Calibri" w:cs="Calibri"/>
+                <w:sz w:val="22"/>
+                <w:szCs w:val="22"/>
+              </w:rPr>
+              <w:t>); 0 = no event, 1 = center-only, 2 = area-only, 3 = both center and area involved in event</w:t>
             </w:r>
           </w:p>
         </w:tc>
@@ -4963,6 +5429,7 @@
         <w:rPr>
           <w:rFonts w:ascii="Calibri" w:hAnsi="Calibri" w:cs="Calibri"/>
         </w:rPr>
+        <w:lastRenderedPageBreak/>
         <w:tab/>
         <w:t xml:space="preserve"> </w:t>
       </w:r>
@@ -5067,6 +5534,7 @@
         </w:rPr>
         <w:t xml:space="preserve">: For single-center cyclones (SCC) and primary centers in multi-center cyclones (MCC), the depth will always be a multiple of </w:t>
       </w:r>
+      <w:proofErr w:type="spellStart"/>
       <w:r>
         <w:rPr>
           <w:rFonts w:ascii="Calibri" w:hAnsi="Calibri" w:cs="Calibri"/>
@@ -5075,12 +5543,14 @@
         </w:rPr>
         <w:t>contint</w:t>
       </w:r>
+      <w:proofErr w:type="spellEnd"/>
       <w:r>
         <w:rPr>
           <w:rFonts w:ascii="Calibri" w:hAnsi="Calibri" w:cs="Calibri"/>
         </w:rPr>
         <w:t xml:space="preserve"> (the contour interval used for area detection).  However, for secondary centers of a MCC (centers which are not the lowest pressure in the system), the depth will probably not be a multiple of </w:t>
       </w:r>
+      <w:proofErr w:type="spellStart"/>
       <w:r>
         <w:rPr>
           <w:rFonts w:ascii="Calibri" w:hAnsi="Calibri" w:cs="Calibri"/>
@@ -5089,6 +5559,7 @@
         </w:rPr>
         <w:t>contint</w:t>
       </w:r>
+      <w:proofErr w:type="spellEnd"/>
       <w:r>
         <w:rPr>
           <w:rFonts w:ascii="Calibri" w:hAnsi="Calibri" w:cs="Calibri"/>
@@ -5185,26 +5656,36 @@
           <w:rFonts w:ascii="Calibri" w:hAnsi="Calibri" w:cs="Calibri"/>
         </w:rPr>
       </w:pPr>
+      <w:proofErr w:type="spellStart"/>
       <w:r>
         <w:rPr>
           <w:rFonts w:ascii="Calibri" w:hAnsi="Calibri" w:cs="Calibri"/>
           <w:b/>
           <w:bCs/>
         </w:rPr>
-        <w:t xml:space="preserve">p_grad: </w:t>
-      </w:r>
-      <w:r>
-        <w:rPr>
-          <w:rFonts w:ascii="Calibri" w:hAnsi="Calibri" w:cs="Calibri"/>
-        </w:rPr>
-        <w:t xml:space="preserve">This is </w:t>
-      </w:r>
+        <w:t>p_grad</w:t>
+      </w:r>
+      <w:proofErr w:type="spellEnd"/>
       <w:r>
         <w:rPr>
           <w:rFonts w:ascii="Calibri" w:hAnsi="Calibri" w:cs="Calibri"/>
           <w:b/>
           <w:bCs/>
         </w:rPr>
+        <w:t xml:space="preserve">: </w:t>
+      </w:r>
+      <w:r>
+        <w:rPr>
+          <w:rFonts w:ascii="Calibri" w:hAnsi="Calibri" w:cs="Calibri"/>
+        </w:rPr>
+        <w:t xml:space="preserve">This is </w:t>
+      </w:r>
+      <w:r>
+        <w:rPr>
+          <w:rFonts w:ascii="Calibri" w:hAnsi="Calibri" w:cs="Calibri"/>
+          <w:b/>
+          <w:bCs/>
+        </w:rPr>
         <w:t>not</w:t>
       </w:r>
       <w:r>
@@ -5213,6 +5694,7 @@
         </w:rPr>
         <w:t xml:space="preserve"> the same as taking depth / radius. Rather, it calculated using a common radius for all cyclones (</w:t>
       </w:r>
+      <w:proofErr w:type="spellStart"/>
       <w:r>
         <w:rPr>
           <w:rFonts w:ascii="Calibri" w:hAnsi="Calibri" w:cs="Calibri"/>
@@ -5221,19 +5703,48 @@
         </w:rPr>
         <w:t>d_dist</w:t>
       </w:r>
+      <w:proofErr w:type="spellEnd"/>
       <w:r>
         <w:rPr>
           <w:rFonts w:ascii="Calibri" w:hAnsi="Calibri" w:cs="Calibri"/>
         </w:rPr>
         <w:t xml:space="preserve"> in the inputs). The value should never be lower than </w:t>
       </w:r>
+      <w:proofErr w:type="spellStart"/>
       <w:r>
         <w:rPr>
           <w:rFonts w:ascii="Calibri" w:hAnsi="Calibri" w:cs="Calibri"/>
           <w:i/>
           <w:iCs/>
         </w:rPr>
-        <w:t xml:space="preserve">d_slp / d_dist </w:t>
+        <w:t>d_slp</w:t>
+      </w:r>
+      <w:proofErr w:type="spellEnd"/>
+      <w:r>
+        <w:rPr>
+          <w:rFonts w:ascii="Calibri" w:hAnsi="Calibri" w:cs="Calibri"/>
+          <w:i/>
+          <w:iCs/>
+        </w:rPr>
+        <w:t xml:space="preserve"> / </w:t>
+      </w:r>
+      <w:proofErr w:type="spellStart"/>
+      <w:r>
+        <w:rPr>
+          <w:rFonts w:ascii="Calibri" w:hAnsi="Calibri" w:cs="Calibri"/>
+          <w:i/>
+          <w:iCs/>
+        </w:rPr>
+        <w:t>d_dist</w:t>
+      </w:r>
+      <w:proofErr w:type="spellEnd"/>
+      <w:r>
+        <w:rPr>
+          <w:rFonts w:ascii="Calibri" w:hAnsi="Calibri" w:cs="Calibri"/>
+          <w:i/>
+          <w:iCs/>
+        </w:rPr>
+        <w:t xml:space="preserve"> </w:t>
       </w:r>
       <w:r>
         <w:rPr>
@@ -5371,7 +5882,35 @@
         <w:rPr>
           <w:rFonts w:ascii="Calibri" w:hAnsi="Calibri" w:cs="Calibri"/>
         </w:rPr>
-        <w:t xml:space="preserve"> You just may need to specify lys=0 and/or dpy=360 in the time functions.</w:t>
+        <w:t xml:space="preserve"> You just may need to specify </w:t>
+      </w:r>
+      <w:proofErr w:type="spellStart"/>
+      <w:r>
+        <w:rPr>
+          <w:rFonts w:ascii="Calibri" w:hAnsi="Calibri" w:cs="Calibri"/>
+        </w:rPr>
+        <w:t>lys</w:t>
+      </w:r>
+      <w:proofErr w:type="spellEnd"/>
+      <w:r>
+        <w:rPr>
+          <w:rFonts w:ascii="Calibri" w:hAnsi="Calibri" w:cs="Calibri"/>
+        </w:rPr>
+        <w:t xml:space="preserve">=0 and/or </w:t>
+      </w:r>
+      <w:proofErr w:type="spellStart"/>
+      <w:r>
+        <w:rPr>
+          <w:rFonts w:ascii="Calibri" w:hAnsi="Calibri" w:cs="Calibri"/>
+        </w:rPr>
+        <w:t>dpy</w:t>
+      </w:r>
+      <w:proofErr w:type="spellEnd"/>
+      <w:r>
+        <w:rPr>
+          <w:rFonts w:ascii="Calibri" w:hAnsi="Calibri" w:cs="Calibri"/>
+        </w:rPr>
+        <w:t>=360 in the time functions.</w:t>
       </w:r>
     </w:p>
     <w:p>
@@ -5459,7 +5998,21 @@
         <w:rPr>
           <w:rFonts w:ascii="Calibri" w:hAnsi="Calibri" w:cs="Calibri"/>
         </w:rPr>
-        <w:t>You may prefer to change directory names or styles, in which case all editing of filepaths can be done on the top-level scripts.</w:t>
+        <w:t xml:space="preserve">You may prefer to change directory names or styles, in which case all editing of </w:t>
+      </w:r>
+      <w:proofErr w:type="spellStart"/>
+      <w:r>
+        <w:rPr>
+          <w:rFonts w:ascii="Calibri" w:hAnsi="Calibri" w:cs="Calibri"/>
+        </w:rPr>
+        <w:t>filepaths</w:t>
+      </w:r>
+      <w:proofErr w:type="spellEnd"/>
+      <w:r>
+        <w:rPr>
+          <w:rFonts w:ascii="Calibri" w:hAnsi="Calibri" w:cs="Calibri"/>
+        </w:rPr>
+        <w:t xml:space="preserve"> can be done on the top-level scripts.</w:t>
       </w:r>
     </w:p>
     <w:p>
@@ -5477,19 +6030,36 @@
           <w:rFonts w:ascii="Calibri" w:hAnsi="Calibri" w:cs="Calibri"/>
         </w:rPr>
       </w:pPr>
+      <w:proofErr w:type="spellStart"/>
       <w:r>
         <w:rPr>
           <w:rFonts w:ascii="Calibri" w:hAnsi="Calibri" w:cs="Calibri"/>
           <w:b/>
         </w:rPr>
-        <w:t xml:space="preserve">BBox: </w:t>
-      </w:r>
-      <w:r>
-        <w:rPr>
-          <w:rFonts w:ascii="Calibri" w:hAnsi="Calibri" w:cs="Calibri"/>
-        </w:rPr>
-        <w:t>I use the “BBox</w:t>
-      </w:r>
+        <w:t>BBox</w:t>
+      </w:r>
+      <w:proofErr w:type="spellEnd"/>
+      <w:r>
+        <w:rPr>
+          <w:rFonts w:ascii="Calibri" w:hAnsi="Calibri" w:cs="Calibri"/>
+          <w:b/>
+        </w:rPr>
+        <w:t xml:space="preserve">: </w:t>
+      </w:r>
+      <w:r>
+        <w:rPr>
+          <w:rFonts w:ascii="Calibri" w:hAnsi="Calibri" w:cs="Calibri"/>
+        </w:rPr>
+        <w:t>I use the “</w:t>
+      </w:r>
+      <w:proofErr w:type="spellStart"/>
+      <w:r>
+        <w:rPr>
+          <w:rFonts w:ascii="Calibri" w:hAnsi="Calibri" w:cs="Calibri"/>
+        </w:rPr>
+        <w:t>BBox</w:t>
+      </w:r>
+      <w:proofErr w:type="spellEnd"/>
       <w:r>
         <w:rPr>
           <w:rFonts w:ascii="Calibri" w:hAnsi="Calibri" w:cs="Calibri"/>
@@ -5524,57 +6094,141 @@
         <w:rPr>
           <w:rFonts w:ascii="Calibri" w:hAnsi="Calibri" w:cs="Calibri"/>
         </w:rPr>
-        <w:t xml:space="preserve"> subset of the data I might want.  (I use the term “BBox” for “bounding box”, even though sometimes “subset” would be more </w:t>
+        <w:t xml:space="preserve"> subset of the data I might want.  (I use the term “</w:t>
+      </w:r>
+      <w:proofErr w:type="spellStart"/>
+      <w:r>
+        <w:rPr>
+          <w:rFonts w:ascii="Calibri" w:hAnsi="Calibri" w:cs="Calibri"/>
+        </w:rPr>
+        <w:t>BBox</w:t>
+      </w:r>
+      <w:proofErr w:type="spellEnd"/>
+      <w:r>
+        <w:rPr>
+          <w:rFonts w:ascii="Calibri" w:hAnsi="Calibri" w:cs="Calibri"/>
+        </w:rPr>
+        <w:t>” for “bounding box”, even though sometimes “subset” would be more appropriate. There’s no reason why you can’t change the name, but if I share any code with “</w:t>
+      </w:r>
+      <w:proofErr w:type="spellStart"/>
+      <w:r>
+        <w:rPr>
+          <w:rFonts w:ascii="Calibri" w:hAnsi="Calibri" w:cs="Calibri"/>
+        </w:rPr>
+        <w:t>BBox</w:t>
+      </w:r>
+      <w:proofErr w:type="spellEnd"/>
+      <w:r>
+        <w:rPr>
+          <w:rFonts w:ascii="Calibri" w:hAnsi="Calibri" w:cs="Calibri"/>
+        </w:rPr>
+        <w:t xml:space="preserve">” in it, you might need to change that code, too.) </w:t>
+      </w:r>
+    </w:p>
+    <w:p>
+      <w:pPr>
+        <w:contextualSpacing/>
+        <w:rPr>
+          <w:rFonts w:ascii="Calibri" w:hAnsi="Calibri" w:cs="Calibri"/>
+        </w:rPr>
+      </w:pPr>
+    </w:p>
+    <w:p>
+      <w:pPr>
+        <w:contextualSpacing/>
+        <w:rPr>
+          <w:rFonts w:ascii="Calibri" w:hAnsi="Calibri" w:cs="Calibri"/>
+        </w:rPr>
+      </w:pPr>
+      <w:r>
+        <w:rPr>
+          <w:rFonts w:ascii="Calibri" w:hAnsi="Calibri" w:cs="Calibri"/>
+          <w:b/>
+        </w:rPr>
+        <w:t>Unique</w:t>
+      </w:r>
+      <w:r>
+        <w:rPr>
+          <w:rFonts w:ascii="Calibri" w:hAnsi="Calibri" w:cs="Calibri"/>
+          <w:b/>
+        </w:rPr>
+        <w:t xml:space="preserve"> Track I</w:t>
+      </w:r>
+      <w:r>
+        <w:rPr>
+          <w:rFonts w:ascii="Calibri" w:hAnsi="Calibri" w:cs="Calibri"/>
+          <w:b/>
+        </w:rPr>
+        <w:t>dentifiers</w:t>
+      </w:r>
+      <w:r>
+        <w:rPr>
+          <w:rFonts w:ascii="Calibri" w:hAnsi="Calibri" w:cs="Calibri"/>
+        </w:rPr>
+        <w:t xml:space="preserve">: there are several id numbers used in this algorithm, and they can be confusing to look at.  For most purposes, if you’re interested in system tracks only, you’re going </w:t>
       </w:r>
       <w:r>
         <w:rPr>
           <w:rFonts w:ascii="Calibri" w:hAnsi="Calibri" w:cs="Calibri"/>
         </w:rPr>
         <w:lastRenderedPageBreak/>
-        <w:t xml:space="preserve">appropriate. There’s no reason why you can’t change the name, but if I share any code with “BBox” in it, you might need to change that code, too.) </w:t>
-      </w:r>
-    </w:p>
-    <w:p>
-      <w:pPr>
-        <w:contextualSpacing/>
-        <w:rPr>
-          <w:rFonts w:ascii="Calibri" w:hAnsi="Calibri" w:cs="Calibri"/>
-        </w:rPr>
-      </w:pPr>
-    </w:p>
-    <w:p>
-      <w:pPr>
-        <w:contextualSpacing/>
-        <w:rPr>
-          <w:rFonts w:ascii="Calibri" w:hAnsi="Calibri" w:cs="Calibri"/>
-        </w:rPr>
-      </w:pPr>
-      <w:r>
-        <w:rPr>
-          <w:rFonts w:ascii="Calibri" w:hAnsi="Calibri" w:cs="Calibri"/>
-          <w:b/>
-        </w:rPr>
-        <w:t>Unique</w:t>
-      </w:r>
-      <w:r>
-        <w:rPr>
-          <w:rFonts w:ascii="Calibri" w:hAnsi="Calibri" w:cs="Calibri"/>
-          <w:b/>
-        </w:rPr>
-        <w:t xml:space="preserve"> Track I</w:t>
-      </w:r>
-      <w:r>
-        <w:rPr>
-          <w:rFonts w:ascii="Calibri" w:hAnsi="Calibri" w:cs="Calibri"/>
-          <w:b/>
-        </w:rPr>
-        <w:t>dentifiers</w:t>
-      </w:r>
-      <w:r>
-        <w:rPr>
-          <w:rFonts w:ascii="Calibri" w:hAnsi="Calibri" w:cs="Calibri"/>
-        </w:rPr>
-        <w:t xml:space="preserve">: there are several id numbers used in this algorithm, and they can be confusing to look at.  For most purposes, if you’re interested in system tracks only, you’re going to be interested in the “sid” (system id).  If you want to ignore the multi-center cyclone aspect and just look at cyclone center tracks, the “tid” (track id) is what you need.  The “ftid” (former track id) and “ptid” (parent track id in a multi-center cyclone) are only needed if you are looking at cyclone interactions.  </w:t>
+        <w:t>to be interested in the “</w:t>
+      </w:r>
+      <w:proofErr w:type="spellStart"/>
+      <w:r>
+        <w:rPr>
+          <w:rFonts w:ascii="Calibri" w:hAnsi="Calibri" w:cs="Calibri"/>
+        </w:rPr>
+        <w:t>sid</w:t>
+      </w:r>
+      <w:proofErr w:type="spellEnd"/>
+      <w:r>
+        <w:rPr>
+          <w:rFonts w:ascii="Calibri" w:hAnsi="Calibri" w:cs="Calibri"/>
+        </w:rPr>
+        <w:t>” (system id).  If you want to ignore the multi-center cyclone aspect and just look at cyclone center tracks, the “</w:t>
+      </w:r>
+      <w:proofErr w:type="spellStart"/>
+      <w:r>
+        <w:rPr>
+          <w:rFonts w:ascii="Calibri" w:hAnsi="Calibri" w:cs="Calibri"/>
+        </w:rPr>
+        <w:t>tid</w:t>
+      </w:r>
+      <w:proofErr w:type="spellEnd"/>
+      <w:r>
+        <w:rPr>
+          <w:rFonts w:ascii="Calibri" w:hAnsi="Calibri" w:cs="Calibri"/>
+        </w:rPr>
+        <w:t>” (track id) is what you need.  The “</w:t>
+      </w:r>
+      <w:proofErr w:type="spellStart"/>
+      <w:r>
+        <w:rPr>
+          <w:rFonts w:ascii="Calibri" w:hAnsi="Calibri" w:cs="Calibri"/>
+        </w:rPr>
+        <w:t>ftid</w:t>
+      </w:r>
+      <w:proofErr w:type="spellEnd"/>
+      <w:r>
+        <w:rPr>
+          <w:rFonts w:ascii="Calibri" w:hAnsi="Calibri" w:cs="Calibri"/>
+        </w:rPr>
+        <w:t>” (former track id) and “</w:t>
+      </w:r>
+      <w:proofErr w:type="spellStart"/>
+      <w:r>
+        <w:rPr>
+          <w:rFonts w:ascii="Calibri" w:hAnsi="Calibri" w:cs="Calibri"/>
+        </w:rPr>
+        <w:t>ptid</w:t>
+      </w:r>
+      <w:proofErr w:type="spellEnd"/>
+      <w:r>
+        <w:rPr>
+          <w:rFonts w:ascii="Calibri" w:hAnsi="Calibri" w:cs="Calibri"/>
+        </w:rPr>
+        <w:t xml:space="preserve">” (parent track id in a multi-center cyclone) are only needed if you are looking at cyclone interactions.  </w:t>
       </w:r>
       <w:r>
         <w:rPr>
@@ -5621,7 +6275,21 @@
         <w:rPr>
           <w:rFonts w:ascii="Calibri" w:hAnsi="Calibri" w:cs="Calibri"/>
         </w:rPr>
-        <w:t xml:space="preserve">A. Output from an algorithm like this invariably includes features that are not of interest.  To limit the output, it is customary to only look at storms satisfying certain criteria.  Common choices are listed below, but note </w:t>
+        <w:t xml:space="preserve">A. Output from an algorithm like this invariably includes features that are not of interest.  To limit the output, it is customary to only look at storms satisfying certain criteria.  Common choices are listed </w:t>
+      </w:r>
+      <w:proofErr w:type="gramStart"/>
+      <w:r>
+        <w:rPr>
+          <w:rFonts w:ascii="Calibri" w:hAnsi="Calibri" w:cs="Calibri"/>
+        </w:rPr>
+        <w:t>below, but</w:t>
+      </w:r>
+      <w:proofErr w:type="gramEnd"/>
+      <w:r>
+        <w:rPr>
+          <w:rFonts w:ascii="Calibri" w:hAnsi="Calibri" w:cs="Calibri"/>
+        </w:rPr>
+        <w:t xml:space="preserve"> note </w:t>
       </w:r>
       <w:r>
         <w:rPr>
@@ -5646,7 +6314,21 @@
         <w:rPr>
           <w:rFonts w:ascii="Calibri" w:hAnsi="Calibri" w:cs="Calibri"/>
         </w:rPr>
-        <w:t>1) Lifespan &gt;= 24 hr (</w:t>
+        <w:t xml:space="preserve">1) Lifespan &gt;= 24 </w:t>
+      </w:r>
+      <w:proofErr w:type="spellStart"/>
+      <w:r>
+        <w:rPr>
+          <w:rFonts w:ascii="Calibri" w:hAnsi="Calibri" w:cs="Calibri"/>
+        </w:rPr>
+        <w:t>hr</w:t>
+      </w:r>
+      <w:proofErr w:type="spellEnd"/>
+      <w:r>
+        <w:rPr>
+          <w:rFonts w:ascii="Calibri" w:hAnsi="Calibri" w:cs="Calibri"/>
+        </w:rPr>
+        <w:t xml:space="preserve"> (</w:t>
       </w:r>
       <w:r>
         <w:rPr>
@@ -5807,7 +6489,19 @@
         <w:rPr>
           <w:rFonts w:ascii="Calibri" w:hAnsi="Calibri" w:cs="Calibri"/>
         </w:rPr>
-        <w:t>*This means that at some point in its track, a storm is at least 500 km from its genesis point. This is helpful for removing spurious result</w:t>
+        <w:t>*</w:t>
+      </w:r>
+      <w:r>
+        <w:rPr>
+          <w:rFonts w:ascii="Calibri" w:hAnsi="Calibri" w:cs="Calibri"/>
+        </w:rPr>
+        <w:t xml:space="preserve"> </w:t>
+      </w:r>
+      <w:r>
+        <w:rPr>
+          <w:rFonts w:ascii="Calibri" w:hAnsi="Calibri" w:cs="Calibri"/>
+        </w:rPr>
+        <w:t>This means that at some point in its track, a storm is at least 500 km from its genesis point. This is helpful for removing spurious result</w:t>
       </w:r>
       <w:r>
         <w:rPr>
@@ -5923,7 +6617,47 @@
         <w:rPr>
           <w:rFonts w:ascii="Calibri" w:hAnsi="Calibri" w:cs="Calibri"/>
         </w:rPr>
-        <w:t xml:space="preserve"> This differs from the max_elev variable used as an input.  Whereas the input parameter determines whether a grid cell can be considered a cyclone center, the post-processing variable determines whether an entire track should be kept.  However, the two are related.  If max_elev = 500 m, having a minimum elevation &lt;= 500 m (or 600 m or 700 m, etc.) criterion is redundant and pointless.</w:t>
+        <w:t xml:space="preserve"> This differs from the </w:t>
+      </w:r>
+      <w:proofErr w:type="spellStart"/>
+      <w:r>
+        <w:rPr>
+          <w:rFonts w:ascii="Calibri" w:hAnsi="Calibri" w:cs="Calibri"/>
+        </w:rPr>
+        <w:t>max_elev</w:t>
+      </w:r>
+      <w:proofErr w:type="spellEnd"/>
+      <w:r>
+        <w:rPr>
+          <w:rFonts w:ascii="Calibri" w:hAnsi="Calibri" w:cs="Calibri"/>
+        </w:rPr>
+        <w:t xml:space="preserve"> variable used as an input.  Whereas the input parameter determines whether a grid cell can be considered a cyclone center, the post-processing variable determines whether an entire track should be kept.  However, the two are related.  If</w:t>
+      </w:r>
+      <w:r>
+        <w:rPr>
+          <w:rFonts w:ascii="Calibri" w:hAnsi="Calibri" w:cs="Calibri"/>
+        </w:rPr>
+        <w:t>, for example,</w:t>
+      </w:r>
+      <w:r>
+        <w:rPr>
+          <w:rFonts w:ascii="Calibri" w:hAnsi="Calibri" w:cs="Calibri"/>
+        </w:rPr>
+        <w:t xml:space="preserve"> </w:t>
+      </w:r>
+      <w:proofErr w:type="spellStart"/>
+      <w:r>
+        <w:rPr>
+          <w:rFonts w:ascii="Calibri" w:hAnsi="Calibri" w:cs="Calibri"/>
+        </w:rPr>
+        <w:t>max_elev</w:t>
+      </w:r>
+      <w:proofErr w:type="spellEnd"/>
+      <w:r>
+        <w:rPr>
+          <w:rFonts w:ascii="Calibri" w:hAnsi="Calibri" w:cs="Calibri"/>
+        </w:rPr>
+        <w:t xml:space="preserve"> = 500 m, having a minimum elevation &lt;= 500 m (or 600 m or 700 m, etc.) criterion is redundant and pointless.</w:t>
       </w:r>
     </w:p>
     <w:p>
@@ -6077,13 +6811,41 @@
         <w:rPr>
           <w:rFonts w:ascii="Calibri" w:hAnsi="Calibri" w:cs="Calibri"/>
         </w:rPr>
-        <w:t xml:space="preserve"> a suite of scripts for subsetting, aggregating, and analyzing results from the algorithm.  </w:t>
-      </w:r>
-      <w:r>
-        <w:rPr>
-          <w:rFonts w:ascii="Calibri" w:hAnsi="Calibri" w:cs="Calibri"/>
-        </w:rPr>
-        <w:t>The following are my main workhorses, so those are the ones I share on github:</w:t>
+        <w:t xml:space="preserve"> a suite of scripts for </w:t>
+      </w:r>
+      <w:proofErr w:type="spellStart"/>
+      <w:r>
+        <w:rPr>
+          <w:rFonts w:ascii="Calibri" w:hAnsi="Calibri" w:cs="Calibri"/>
+        </w:rPr>
+        <w:t>subsetting</w:t>
+      </w:r>
+      <w:proofErr w:type="spellEnd"/>
+      <w:r>
+        <w:rPr>
+          <w:rFonts w:ascii="Calibri" w:hAnsi="Calibri" w:cs="Calibri"/>
+        </w:rPr>
+        <w:t xml:space="preserve">, aggregating, and analyzing results from the algorithm.  </w:t>
+      </w:r>
+      <w:r>
+        <w:rPr>
+          <w:rFonts w:ascii="Calibri" w:hAnsi="Calibri" w:cs="Calibri"/>
+        </w:rPr>
+        <w:t xml:space="preserve">The following are my main workhorses, so those are the ones I share on </w:t>
+      </w:r>
+      <w:proofErr w:type="spellStart"/>
+      <w:r>
+        <w:rPr>
+          <w:rFonts w:ascii="Calibri" w:hAnsi="Calibri" w:cs="Calibri"/>
+        </w:rPr>
+        <w:t>github</w:t>
+      </w:r>
+      <w:proofErr w:type="spellEnd"/>
+      <w:r>
+        <w:rPr>
+          <w:rFonts w:ascii="Calibri" w:hAnsi="Calibri" w:cs="Calibri"/>
+        </w:rPr>
+        <w:t>:</w:t>
       </w:r>
     </w:p>
     <w:p>
@@ -6139,7 +6901,23 @@
           <w:rFonts w:ascii="Calibri" w:hAnsi="Calibri" w:cs="Calibri"/>
           <w:bCs/>
         </w:rPr>
-        <w:t xml:space="preserve"> = Subsetting of cyclone output by location and other characteristics</w:t>
+        <w:t xml:space="preserve"> = </w:t>
+      </w:r>
+      <w:proofErr w:type="spellStart"/>
+      <w:r>
+        <w:rPr>
+          <w:rFonts w:ascii="Calibri" w:hAnsi="Calibri" w:cs="Calibri"/>
+          <w:bCs/>
+        </w:rPr>
+        <w:t>Subsetting</w:t>
+      </w:r>
+      <w:proofErr w:type="spellEnd"/>
+      <w:r>
+        <w:rPr>
+          <w:rFonts w:ascii="Calibri" w:hAnsi="Calibri" w:cs="Calibri"/>
+          <w:bCs/>
+        </w:rPr>
+        <w:t xml:space="preserve"> of cyclone output by location and other characteristics</w:t>
       </w:r>
     </w:p>
     <w:p>
@@ -6160,7 +6938,6 @@
           <w:rFonts w:ascii="Calibri" w:hAnsi="Calibri" w:cs="Calibri"/>
           <w:bCs/>
         </w:rPr>
-        <w:lastRenderedPageBreak/>
         <w:t>C</w:t>
       </w:r>
       <w:r>
@@ -6224,22 +7001,47 @@
           <w:rFonts w:ascii="Calibri" w:hAnsi="Calibri" w:cs="Calibri"/>
           <w:bCs/>
         </w:rPr>
-        <w:t xml:space="preserve"> = Aggregation of cyclone characteristics by month/season, including climatologies; the output is </w:t>
-      </w:r>
+        <w:t xml:space="preserve"> = Aggregation of cyclone characteristics by month/season, including </w:t>
+      </w:r>
+      <w:proofErr w:type="spellStart"/>
       <w:r>
         <w:rPr>
           <w:rFonts w:ascii="Calibri" w:hAnsi="Calibri" w:cs="Calibri"/>
           <w:bCs/>
         </w:rPr>
-        <w:t>netcdf files.</w:t>
-      </w:r>
-    </w:p>
-    <w:p>
-      <w:pPr>
+        <w:t>climatologies</w:t>
+      </w:r>
+      <w:proofErr w:type="spellEnd"/>
+      <w:r>
         <w:rPr>
           <w:rFonts w:ascii="Calibri" w:hAnsi="Calibri" w:cs="Calibri"/>
           <w:bCs/>
         </w:rPr>
+        <w:t xml:space="preserve">; the output is </w:t>
+      </w:r>
+      <w:proofErr w:type="spellStart"/>
+      <w:r>
+        <w:rPr>
+          <w:rFonts w:ascii="Calibri" w:hAnsi="Calibri" w:cs="Calibri"/>
+          <w:bCs/>
+        </w:rPr>
+        <w:t>netcdf</w:t>
+      </w:r>
+      <w:proofErr w:type="spellEnd"/>
+      <w:r>
+        <w:rPr>
+          <w:rFonts w:ascii="Calibri" w:hAnsi="Calibri" w:cs="Calibri"/>
+          <w:bCs/>
+        </w:rPr>
+        <w:t xml:space="preserve"> files.</w:t>
+      </w:r>
+    </w:p>
+    <w:p>
+      <w:pPr>
+        <w:rPr>
+          <w:rFonts w:ascii="Calibri" w:hAnsi="Calibri" w:cs="Calibri"/>
+          <w:bCs/>
+        </w:rPr>
       </w:pPr>
     </w:p>
     <w:p>
@@ -6247,6 +7049,7 @@
         <w:pStyle w:val="Heading1"/>
       </w:pPr>
       <w:r>
+        <w:lastRenderedPageBreak/>
         <w:t>5</w:t>
       </w:r>
       <w:r>
@@ -6490,7 +7293,21 @@
         <w:rPr>
           <w:rFonts w:ascii="Calibri" w:hAnsi="Calibri" w:cs="Calibri"/>
         </w:rPr>
-        <w:t xml:space="preserve">of at least 1000 km (trackLength </w:t>
+        <w:t>of at least 1000 km (</w:t>
+      </w:r>
+      <w:proofErr w:type="spellStart"/>
+      <w:r>
+        <w:rPr>
+          <w:rFonts w:ascii="Calibri" w:hAnsi="Calibri" w:cs="Calibri"/>
+        </w:rPr>
+        <w:t>trackLength</w:t>
+      </w:r>
+      <w:proofErr w:type="spellEnd"/>
+      <w:r>
+        <w:rPr>
+          <w:rFonts w:ascii="Calibri" w:hAnsi="Calibri" w:cs="Calibri"/>
+        </w:rPr>
+        <w:t xml:space="preserve"> </w:t>
       </w:r>
       <w:r>
         <w:rPr>
@@ -6534,7 +7351,21 @@
         <w:rPr>
           <w:rFonts w:ascii="Calibri" w:hAnsi="Calibri" w:cs="Calibri"/>
         </w:rPr>
-        <w:t xml:space="preserve">That said, note that because I’m always tweaking the algorithm, it’s always possible I update the code and forget I need to update the “CompareToTheseResults” folder on Google Drive. If that’s the case, you might see discrepancies around 1% or 5%. If you’re seeing differences of 10% or more, though, that means something is wrong. </w:t>
+        <w:t>That said, note that because I’m always tweaking the algorithm, it’s always possible I update the code and forget I need to update the “</w:t>
+      </w:r>
+      <w:proofErr w:type="spellStart"/>
+      <w:r>
+        <w:rPr>
+          <w:rFonts w:ascii="Calibri" w:hAnsi="Calibri" w:cs="Calibri"/>
+        </w:rPr>
+        <w:t>CompareToTheseResults</w:t>
+      </w:r>
+      <w:proofErr w:type="spellEnd"/>
+      <w:r>
+        <w:rPr>
+          <w:rFonts w:ascii="Calibri" w:hAnsi="Calibri" w:cs="Calibri"/>
+        </w:rPr>
+        <w:t xml:space="preserve">” folder on Google Drive. If that’s the case, you might see discrepancies around 1% or 5%. If you’re seeing differences of 10% or more, though, that means something is wrong. </w:t>
       </w:r>
     </w:p>
     <w:p>
@@ -6665,7 +7496,21 @@
         <w:rPr>
           <w:rFonts w:ascii="Calibri" w:hAnsi="Calibri" w:cs="Calibri"/>
         </w:rPr>
-        <w:t>A fix to a bug in the “regenesis” code that mixed up cyclone IDs for a small percentage of cases</w:t>
+        <w:t>A fix to a bug in the “</w:t>
+      </w:r>
+      <w:proofErr w:type="spellStart"/>
+      <w:r>
+        <w:rPr>
+          <w:rFonts w:ascii="Calibri" w:hAnsi="Calibri" w:cs="Calibri"/>
+        </w:rPr>
+        <w:t>regenesis</w:t>
+      </w:r>
+      <w:proofErr w:type="spellEnd"/>
+      <w:r>
+        <w:rPr>
+          <w:rFonts w:ascii="Calibri" w:hAnsi="Calibri" w:cs="Calibri"/>
+        </w:rPr>
+        <w:t>” code that mixed up cyclone IDs for a small percentage of cases</w:t>
       </w:r>
     </w:p>
     <w:p>
@@ -6683,7 +7528,19 @@
         <w:rPr>
           <w:rFonts w:ascii="Calibri" w:hAnsi="Calibri" w:cs="Calibri"/>
         </w:rPr>
-        <w:t>The addition of a track matching function for assessing the impact of using different parameters or inputs.</w:t>
+        <w:t>The addition of a track</w:t>
+      </w:r>
+      <w:r>
+        <w:rPr>
+          <w:rFonts w:ascii="Calibri" w:hAnsi="Calibri" w:cs="Calibri"/>
+        </w:rPr>
+        <w:t>-</w:t>
+      </w:r>
+      <w:r>
+        <w:rPr>
+          <w:rFonts w:ascii="Calibri" w:hAnsi="Calibri" w:cs="Calibri"/>
+        </w:rPr>
+        <w:t>matching function for assessing the impact of using different parameters or inputs.</w:t>
       </w:r>
     </w:p>
     <w:p>
@@ -6745,7 +7602,61 @@
         <w:rPr>
           <w:rFonts w:ascii="Calibri" w:hAnsi="Calibri" w:cs="Calibri"/>
         </w:rPr>
-        <w:t>All inputs and outputs are down netcdf or custom Python objects that have been pickled (.pkl). Pickled objects can be opened with the pandas module. This means the algorithm no longer uses GDAL for anything.</w:t>
+        <w:t xml:space="preserve">All inputs and outputs are </w:t>
+      </w:r>
+      <w:r>
+        <w:rPr>
+          <w:rFonts w:ascii="Calibri" w:hAnsi="Calibri" w:cs="Calibri"/>
+        </w:rPr>
+        <w:t>now</w:t>
+      </w:r>
+      <w:r>
+        <w:rPr>
+          <w:rFonts w:ascii="Calibri" w:hAnsi="Calibri" w:cs="Calibri"/>
+        </w:rPr>
+        <w:t xml:space="preserve"> </w:t>
+      </w:r>
+      <w:proofErr w:type="spellStart"/>
+      <w:r>
+        <w:rPr>
+          <w:rFonts w:ascii="Calibri" w:hAnsi="Calibri" w:cs="Calibri"/>
+        </w:rPr>
+        <w:t>netcdf</w:t>
+      </w:r>
+      <w:proofErr w:type="spellEnd"/>
+      <w:r>
+        <w:rPr>
+          <w:rFonts w:ascii="Calibri" w:hAnsi="Calibri" w:cs="Calibri"/>
+        </w:rPr>
+        <w:t xml:space="preserve"> or custom Python objects that have been pickled (.</w:t>
+      </w:r>
+      <w:proofErr w:type="spellStart"/>
+      <w:r>
+        <w:rPr>
+          <w:rFonts w:ascii="Calibri" w:hAnsi="Calibri" w:cs="Calibri"/>
+        </w:rPr>
+        <w:t>pkl</w:t>
+      </w:r>
+      <w:proofErr w:type="spellEnd"/>
+      <w:r>
+        <w:rPr>
+          <w:rFonts w:ascii="Calibri" w:hAnsi="Calibri" w:cs="Calibri"/>
+        </w:rPr>
+        <w:t xml:space="preserve">). Pickled objects can be opened with the </w:t>
+      </w:r>
+      <w:proofErr w:type="gramStart"/>
+      <w:r>
+        <w:rPr>
+          <w:rFonts w:ascii="Calibri" w:hAnsi="Calibri" w:cs="Calibri"/>
+        </w:rPr>
+        <w:t>pandas</w:t>
+      </w:r>
+      <w:proofErr w:type="gramEnd"/>
+      <w:r>
+        <w:rPr>
+          <w:rFonts w:ascii="Calibri" w:hAnsi="Calibri" w:cs="Calibri"/>
+        </w:rPr>
+        <w:t xml:space="preserve"> module. This means the algorithm no longer uses GDAL.</w:t>
       </w:r>
     </w:p>
     <w:p>
@@ -6763,7 +7674,6 @@
         <w:rPr>
           <w:rFonts w:ascii="Calibri" w:hAnsi="Calibri" w:cs="Calibri"/>
         </w:rPr>
-        <w:lastRenderedPageBreak/>
         <w:t>I’ve switched from grids that have the north pole at the center of a grid cell to grids that have the north pole at the vertex, so the example data is slightly different than in the past.</w:t>
       </w:r>
     </w:p>
@@ -6782,7 +7692,19 @@
         <w:rPr>
           <w:rFonts w:ascii="Calibri" w:hAnsi="Calibri" w:cs="Calibri"/>
         </w:rPr>
-        <w:t xml:space="preserve">The kernel size is now defined as a distance in km instead of grid cells. Doing removes the sensitivity of results to spatial resolution. </w:t>
+        <w:t xml:space="preserve">The kernel size is now defined as a distance in km instead of grid cells. Doing </w:t>
+      </w:r>
+      <w:r>
+        <w:rPr>
+          <w:rFonts w:ascii="Calibri" w:hAnsi="Calibri" w:cs="Calibri"/>
+        </w:rPr>
+        <w:t xml:space="preserve">so </w:t>
+      </w:r>
+      <w:r>
+        <w:rPr>
+          <w:rFonts w:ascii="Calibri" w:hAnsi="Calibri" w:cs="Calibri"/>
+        </w:rPr>
+        <w:t xml:space="preserve">removes the sensitivity of results to spatial resolution. </w:t>
       </w:r>
     </w:p>
     <w:p>
@@ -6800,6 +7722,7 @@
         <w:rPr>
           <w:rFonts w:ascii="Calibri" w:hAnsi="Calibri" w:cs="Calibri"/>
         </w:rPr>
+        <w:lastRenderedPageBreak/>
         <w:t>For cases where two tracks merge, only one of those tracks is continued. The nearest-neighbor track is continued by default, but if both cyclones are the same distance from the merge point in the prior time step, the deeper center is now continued instead of the older center. This results in a reduction in lifespan for the longest-lived storms and makes more intense storms more likely to be continued. However, it effects only a very small percentage of tracks.</w:t>
       </w:r>
     </w:p>
@@ -6818,7 +7741,21 @@
         <w:rPr>
           <w:rFonts w:ascii="Calibri" w:hAnsi="Calibri" w:cs="Calibri"/>
         </w:rPr>
-        <w:t>The algorithm is faster thanks to some optimization of the kernelgradient and Laplacian functions.</w:t>
+        <w:t xml:space="preserve">The algorithm is faster thanks to some optimization of the </w:t>
+      </w:r>
+      <w:proofErr w:type="spellStart"/>
+      <w:r>
+        <w:rPr>
+          <w:rFonts w:ascii="Calibri" w:hAnsi="Calibri" w:cs="Calibri"/>
+        </w:rPr>
+        <w:t>kernelgradient</w:t>
+      </w:r>
+      <w:proofErr w:type="spellEnd"/>
+      <w:r>
+        <w:rPr>
+          <w:rFonts w:ascii="Calibri" w:hAnsi="Calibri" w:cs="Calibri"/>
+        </w:rPr>
+        <w:t xml:space="preserve"> and Laplacian functions.</w:t>
       </w:r>
     </w:p>
     <w:p>
@@ -6836,7 +7773,19 @@
         <w:rPr>
           <w:rFonts w:ascii="Calibri" w:hAnsi="Calibri" w:cs="Calibri"/>
         </w:rPr>
-        <w:t>The detection output has reduced file size by removable of a redundant output field and by saving the data as 8-bit unsigned integers.</w:t>
+        <w:t>The detection output has reduced file size by remova</w:t>
+      </w:r>
+      <w:r>
+        <w:rPr>
+          <w:rFonts w:ascii="Calibri" w:hAnsi="Calibri" w:cs="Calibri"/>
+        </w:rPr>
+        <w:t>l</w:t>
+      </w:r>
+      <w:r>
+        <w:rPr>
+          <w:rFonts w:ascii="Calibri" w:hAnsi="Calibri" w:cs="Calibri"/>
+        </w:rPr>
+        <w:t xml:space="preserve"> of a redundant output field and by saving the data as 8-bit unsigned integers.</w:t>
       </w:r>
     </w:p>
     <w:p>
@@ -6854,7 +7803,21 @@
         <w:rPr>
           <w:rFonts w:ascii="Calibri" w:hAnsi="Calibri" w:cs="Calibri"/>
         </w:rPr>
-        <w:t>Using xesmf instead of basemap for reprojection.</w:t>
+        <w:t xml:space="preserve">Using </w:t>
+      </w:r>
+      <w:proofErr w:type="spellStart"/>
+      <w:r>
+        <w:rPr>
+          <w:rFonts w:ascii="Calibri" w:hAnsi="Calibri" w:cs="Calibri"/>
+        </w:rPr>
+        <w:t>xesmf</w:t>
+      </w:r>
+      <w:proofErr w:type="spellEnd"/>
+      <w:r>
+        <w:rPr>
+          <w:rFonts w:ascii="Calibri" w:hAnsi="Calibri" w:cs="Calibri"/>
+        </w:rPr>
+        <w:t xml:space="preserve"> instead of basemap for reprojection.</w:t>
       </w:r>
     </w:p>
     <w:p>
@@ -6902,7 +7865,21 @@
         <w:rPr>
           <w:rFonts w:ascii="Calibri" w:hAnsi="Calibri" w:cs="Calibri"/>
         </w:rPr>
-        <w:t xml:space="preserve"> when NaNs are counted</w:t>
+        <w:t xml:space="preserve"> when </w:t>
+      </w:r>
+      <w:proofErr w:type="spellStart"/>
+      <w:r>
+        <w:rPr>
+          <w:rFonts w:ascii="Calibri" w:hAnsi="Calibri" w:cs="Calibri"/>
+        </w:rPr>
+        <w:t>NaNs</w:t>
+      </w:r>
+      <w:proofErr w:type="spellEnd"/>
+      <w:r>
+        <w:rPr>
+          <w:rFonts w:ascii="Calibri" w:hAnsi="Calibri" w:cs="Calibri"/>
+        </w:rPr>
+        <w:t xml:space="preserve"> are counted</w:t>
       </w:r>
       <w:r>
         <w:rPr>
@@ -6962,7 +7939,21 @@
         <w:rPr>
           <w:rFonts w:ascii="Calibri" w:hAnsi="Calibri" w:cs="Calibri"/>
         </w:rPr>
-        <w:t>Changed u and v variables in standard cyclone dataframe to be velocity instead of speed</w:t>
+        <w:t xml:space="preserve">Changed u and v variables in standard cyclone </w:t>
+      </w:r>
+      <w:proofErr w:type="spellStart"/>
+      <w:r>
+        <w:rPr>
+          <w:rFonts w:ascii="Calibri" w:hAnsi="Calibri" w:cs="Calibri"/>
+        </w:rPr>
+        <w:t>dataframe</w:t>
+      </w:r>
+      <w:proofErr w:type="spellEnd"/>
+      <w:r>
+        <w:rPr>
+          <w:rFonts w:ascii="Calibri" w:hAnsi="Calibri" w:cs="Calibri"/>
+        </w:rPr>
+        <w:t xml:space="preserve"> to be velocity instead of speed</w:t>
       </w:r>
     </w:p>
     <w:p>
@@ -6992,7 +7983,21 @@
         <w:rPr>
           <w:rFonts w:ascii="Calibri" w:hAnsi="Calibri" w:cs="Calibri"/>
         </w:rPr>
-        <w:t xml:space="preserve"> standard cyclone dataframe output</w:t>
+        <w:t xml:space="preserve"> standard cyclone </w:t>
+      </w:r>
+      <w:proofErr w:type="spellStart"/>
+      <w:r>
+        <w:rPr>
+          <w:rFonts w:ascii="Calibri" w:hAnsi="Calibri" w:cs="Calibri"/>
+        </w:rPr>
+        <w:t>dataframe</w:t>
+      </w:r>
+      <w:proofErr w:type="spellEnd"/>
+      <w:r>
+        <w:rPr>
+          <w:rFonts w:ascii="Calibri" w:hAnsi="Calibri" w:cs="Calibri"/>
+        </w:rPr>
+        <w:t xml:space="preserve"> output</w:t>
       </w:r>
       <w:r>
         <w:rPr>
@@ -7016,7 +8021,21 @@
         <w:rPr>
           <w:rFonts w:ascii="Calibri" w:hAnsi="Calibri" w:cs="Calibri"/>
         </w:rPr>
-        <w:t>Replaced all "longs" with "lons" when referring to longitude</w:t>
+        <w:t>Replaced all "longs" with "</w:t>
+      </w:r>
+      <w:proofErr w:type="spellStart"/>
+      <w:r>
+        <w:rPr>
+          <w:rFonts w:ascii="Calibri" w:hAnsi="Calibri" w:cs="Calibri"/>
+        </w:rPr>
+        <w:t>lons</w:t>
+      </w:r>
+      <w:proofErr w:type="spellEnd"/>
+      <w:r>
+        <w:rPr>
+          <w:rFonts w:ascii="Calibri" w:hAnsi="Calibri" w:cs="Calibri"/>
+        </w:rPr>
+        <w:t>" when referring to longitude</w:t>
       </w:r>
       <w:r>
         <w:rPr>
@@ -7040,19 +8059,7 @@
         <w:rPr>
           <w:rFonts w:ascii="Calibri" w:hAnsi="Calibri" w:cs="Calibri"/>
         </w:rPr>
-        <w:t xml:space="preserve">Changed sorting of </w:t>
-      </w:r>
-      <w:r>
-        <w:rPr>
-          <w:rFonts w:ascii="Calibri" w:hAnsi="Calibri" w:cs="Calibri"/>
-        </w:rPr>
-        <w:t xml:space="preserve">cyclone </w:t>
-      </w:r>
-      <w:r>
-        <w:rPr>
-          <w:rFonts w:ascii="Calibri" w:hAnsi="Calibri" w:cs="Calibri"/>
-        </w:rPr>
-        <w:t>main data frame to no longer always be alphabetical</w:t>
+        <w:t>Changed sorting of cyclone main data frame to no longer always be alphabetical</w:t>
       </w:r>
     </w:p>
     <w:p>
@@ -7070,19 +8077,7 @@
         <w:rPr>
           <w:rFonts w:ascii="Calibri" w:hAnsi="Calibri" w:cs="Calibri"/>
         </w:rPr>
-        <w:t xml:space="preserve">Added the SLP gradient measure used to limit cyclone detection as a variable in the main </w:t>
-      </w:r>
-      <w:r>
-        <w:rPr>
-          <w:rFonts w:ascii="Calibri" w:hAnsi="Calibri" w:cs="Calibri"/>
-        </w:rPr>
-        <w:t xml:space="preserve">cyclone </w:t>
-      </w:r>
-      <w:r>
-        <w:rPr>
-          <w:rFonts w:ascii="Calibri" w:hAnsi="Calibri" w:cs="Calibri"/>
-        </w:rPr>
-        <w:t>data frame</w:t>
+        <w:t>Added the SLP gradient measure used to limit cyclone detection as a variable in the main cyclone data frame</w:t>
       </w:r>
       <w:r>
         <w:rPr>
@@ -7106,37 +8101,27 @@
         <w:rPr>
           <w:rFonts w:ascii="Calibri" w:hAnsi="Calibri" w:cs="Calibri"/>
         </w:rPr>
-        <w:t>Added try/except statements to the cTrack2sTrack function so that it will ignore</w:t>
-      </w:r>
-      <w:r>
-        <w:rPr>
-          <w:rFonts w:ascii="Calibri" w:hAnsi="Calibri" w:cs="Calibri"/>
-        </w:rPr>
-        <w:t xml:space="preserve"> </w:t>
-      </w:r>
-      <w:r>
-        <w:rPr>
-          <w:rFonts w:ascii="Calibri" w:hAnsi="Calibri" w:cs="Calibri"/>
-        </w:rPr>
-        <w:t>cases where tids between two months don't align inste</w:t>
-      </w:r>
-      <w:r>
-        <w:rPr>
-          <w:rFonts w:ascii="Calibri" w:hAnsi="Calibri" w:cs="Calibri"/>
-        </w:rPr>
-        <w:t>a</w:t>
-      </w:r>
-      <w:r>
-        <w:rPr>
-          <w:rFonts w:ascii="Calibri" w:hAnsi="Calibri" w:cs="Calibri"/>
-        </w:rPr>
-        <w:t>d of breaking.</w:t>
-      </w:r>
-      <w:r>
-        <w:rPr>
-          <w:rFonts w:ascii="Calibri" w:hAnsi="Calibri" w:cs="Calibri"/>
-        </w:rPr>
-        <w:t xml:space="preserve"> </w:t>
+        <w:t xml:space="preserve">Added try/except statements to the cTrack2sTrack function so that it will ignore cases where </w:t>
+      </w:r>
+      <w:proofErr w:type="spellStart"/>
+      <w:r>
+        <w:rPr>
+          <w:rFonts w:ascii="Calibri" w:hAnsi="Calibri" w:cs="Calibri"/>
+        </w:rPr>
+        <w:t>tids</w:t>
+      </w:r>
+      <w:proofErr w:type="spellEnd"/>
+      <w:r>
+        <w:rPr>
+          <w:rFonts w:ascii="Calibri" w:hAnsi="Calibri" w:cs="Calibri"/>
+        </w:rPr>
+        <w:t xml:space="preserve"> between two months don't align instead of breaking. </w:t>
+      </w:r>
+      <w:r>
+        <w:rPr>
+          <w:rFonts w:ascii="Calibri" w:hAnsi="Calibri" w:cs="Calibri"/>
+        </w:rPr>
+        <w:t>P</w:t>
       </w:r>
       <w:r>
         <w:rPr>
@@ -7156,7 +8141,7 @@
 </file>
 
 <file path=word/endnotes.xml><?xml version="1.0" encoding="utf-8"?>
-<w:endnotes xmlns:wpc="http://schemas.microsoft.com/office/word/2010/wordprocessingCanvas" xmlns:cx="http://schemas.microsoft.com/office/drawing/2014/chartex" xmlns:cx1="http://schemas.microsoft.com/office/drawing/2015/9/8/chartex" xmlns:cx2="http://schemas.microsoft.com/office/drawing/2015/10/21/chartex" xmlns:cx3="http://schemas.microsoft.com/office/drawing/2016/5/9/chartex" xmlns:cx4="http://schemas.microsoft.com/office/drawing/2016/5/10/chartex" xmlns:cx5="http://schemas.microsoft.com/office/drawing/2016/5/11/chartex" xmlns:cx6="http://schemas.microsoft.com/office/drawing/2016/5/12/chartex" xmlns:cx7="http://schemas.microsoft.com/office/drawing/2016/5/13/chartex" xmlns:cx8="http://schemas.microsoft.com/office/drawing/2016/5/14/chartex" xmlns:mc="http://schemas.openxmlformats.org/markup-compatibility/2006" xmlns:aink="http://schemas.microsoft.com/office/drawing/2016/ink" xmlns:am3d="http://schemas.microsoft.com/office/drawing/2017/model3d" xmlns:o="urn:schemas-microsoft-com:office:office" xmlns:oel="http://schemas.microsoft.com/office/2019/extlst" xmlns:r="http://schemas.openxmlformats.org/officeDocument/2006/relationships" xmlns:m="http://schemas.openxmlformats.org/officeDocument/2006/math" xmlns:v="urn:schemas-microsoft-com:vml" xmlns:wp14="http://schemas.microsoft.com/office/word/2010/wordprocessingDrawing" xmlns:wp="http://schemas.openxmlformats.org/drawingml/2006/wordprocessingDrawing" xmlns:w10="urn:schemas-microsoft-com:office:word" xmlns:w="http://schemas.openxmlformats.org/wordprocessingml/2006/main" xmlns:w14="http://schemas.microsoft.com/office/word/2010/wordml" xmlns:w15="http://schemas.microsoft.com/office/word/2012/wordml" xmlns:w16cex="http://schemas.microsoft.com/office/word/2018/wordml/cex" xmlns:w16cid="http://schemas.microsoft.com/office/word/2016/wordml/cid" xmlns:w16="http://schemas.microsoft.com/office/word/2018/wordml" xmlns:w16sdtdh="http://schemas.microsoft.com/office/word/2020/wordml/sdtdatahash" xmlns:w16se="http://schemas.microsoft.com/office/word/2015/wordml/symex" xmlns:wpg="http://schemas.microsoft.com/office/word/2010/wordprocessingGroup" xmlns:wpi="http://schemas.microsoft.com/office/word/2010/wordprocessingInk" xmlns:wne="http://schemas.microsoft.com/office/word/2006/wordml" xmlns:wps="http://schemas.microsoft.com/office/word/2010/wordprocessingShape" mc:Ignorable="w14 w15 w16se w16cid w16 w16cex w16sdtdh wp14">
+<w:endnotes xmlns:wpc="http://schemas.microsoft.com/office/word/2010/wordprocessingCanvas" xmlns:cx="http://schemas.microsoft.com/office/drawing/2014/chartex" xmlns:cx1="http://schemas.microsoft.com/office/drawing/2015/9/8/chartex" xmlns:cx2="http://schemas.microsoft.com/office/drawing/2015/10/21/chartex" xmlns:cx3="http://schemas.microsoft.com/office/drawing/2016/5/9/chartex" xmlns:cx4="http://schemas.microsoft.com/office/drawing/2016/5/10/chartex" xmlns:cx5="http://schemas.microsoft.com/office/drawing/2016/5/11/chartex" xmlns:cx6="http://schemas.microsoft.com/office/drawing/2016/5/12/chartex" xmlns:cx7="http://schemas.microsoft.com/office/drawing/2016/5/13/chartex" xmlns:cx8="http://schemas.microsoft.com/office/drawing/2016/5/14/chartex" xmlns:mc="http://schemas.openxmlformats.org/markup-compatibility/2006" xmlns:aink="http://schemas.microsoft.com/office/drawing/2016/ink" xmlns:am3d="http://schemas.microsoft.com/office/drawing/2017/model3d" xmlns:o="urn:schemas-microsoft-com:office:office" xmlns:oel="http://schemas.microsoft.com/office/2019/extlst" xmlns:r="http://schemas.openxmlformats.org/officeDocument/2006/relationships" xmlns:m="http://schemas.openxmlformats.org/officeDocument/2006/math" xmlns:v="urn:schemas-microsoft-com:vml" xmlns:wp14="http://schemas.microsoft.com/office/word/2010/wordprocessingDrawing" xmlns:wp="http://schemas.openxmlformats.org/drawingml/2006/wordprocessingDrawing" xmlns:w10="urn:schemas-microsoft-com:office:word" xmlns:w="http://schemas.openxmlformats.org/wordprocessingml/2006/main" xmlns:w14="http://schemas.microsoft.com/office/word/2010/wordml" xmlns:w15="http://schemas.microsoft.com/office/word/2012/wordml" xmlns:w16cex="http://schemas.microsoft.com/office/word/2018/wordml/cex" xmlns:w16cid="http://schemas.microsoft.com/office/word/2016/wordml/cid" xmlns:w16="http://schemas.microsoft.com/office/word/2018/wordml" xmlns:w16du="http://schemas.microsoft.com/office/word/2023/wordml/word16du" xmlns:w16sdtdh="http://schemas.microsoft.com/office/word/2020/wordml/sdtdatahash" xmlns:w16se="http://schemas.microsoft.com/office/word/2015/wordml/symex" xmlns:wpg="http://schemas.microsoft.com/office/word/2010/wordprocessingGroup" xmlns:wpi="http://schemas.microsoft.com/office/word/2010/wordprocessingInk" xmlns:wne="http://schemas.microsoft.com/office/word/2006/wordml" xmlns:wps="http://schemas.microsoft.com/office/word/2010/wordprocessingShape" mc:Ignorable="w14 w15 w16se w16cid w16 w16cex w16sdtdh w16du wp14">
   <w:endnote w:type="separator" w:id="-1">
     <w:p>
       <w:r>
@@ -7175,7 +8160,7 @@
 </file>
 
 <file path=word/footnotes.xml><?xml version="1.0" encoding="utf-8"?>
-<w:footnotes xmlns:wpc="http://schemas.microsoft.com/office/word/2010/wordprocessingCanvas" xmlns:cx="http://schemas.microsoft.com/office/drawing/2014/chartex" xmlns:cx1="http://schemas.microsoft.com/office/drawing/2015/9/8/chartex" xmlns:cx2="http://schemas.microsoft.com/office/drawing/2015/10/21/chartex" xmlns:cx3="http://schemas.microsoft.com/office/drawing/2016/5/9/chartex" xmlns:cx4="http://schemas.microsoft.com/office/drawing/2016/5/10/chartex" xmlns:cx5="http://schemas.microsoft.com/office/drawing/2016/5/11/chartex" xmlns:cx6="http://schemas.microsoft.com/office/drawing/2016/5/12/chartex" xmlns:cx7="http://schemas.microsoft.com/office/drawing/2016/5/13/chartex" xmlns:cx8="http://schemas.microsoft.com/office/drawing/2016/5/14/chartex" xmlns:mc="http://schemas.openxmlformats.org/markup-compatibility/2006" xmlns:aink="http://schemas.microsoft.com/office/drawing/2016/ink" xmlns:am3d="http://schemas.microsoft.com/office/drawing/2017/model3d" xmlns:o="urn:schemas-microsoft-com:office:office" xmlns:oel="http://schemas.microsoft.com/office/2019/extlst" xmlns:r="http://schemas.openxmlformats.org/officeDocument/2006/relationships" xmlns:m="http://schemas.openxmlformats.org/officeDocument/2006/math" xmlns:v="urn:schemas-microsoft-com:vml" xmlns:wp14="http://schemas.microsoft.com/office/word/2010/wordprocessingDrawing" xmlns:wp="http://schemas.openxmlformats.org/drawingml/2006/wordprocessingDrawing" xmlns:w10="urn:schemas-microsoft-com:office:word" xmlns:w="http://schemas.openxmlformats.org/wordprocessingml/2006/main" xmlns:w14="http://schemas.microsoft.com/office/word/2010/wordml" xmlns:w15="http://schemas.microsoft.com/office/word/2012/wordml" xmlns:w16cex="http://schemas.microsoft.com/office/word/2018/wordml/cex" xmlns:w16cid="http://schemas.microsoft.com/office/word/2016/wordml/cid" xmlns:w16="http://schemas.microsoft.com/office/word/2018/wordml" xmlns:w16sdtdh="http://schemas.microsoft.com/office/word/2020/wordml/sdtdatahash" xmlns:w16se="http://schemas.microsoft.com/office/word/2015/wordml/symex" xmlns:wpg="http://schemas.microsoft.com/office/word/2010/wordprocessingGroup" xmlns:wpi="http://schemas.microsoft.com/office/word/2010/wordprocessingInk" xmlns:wne="http://schemas.microsoft.com/office/word/2006/wordml" xmlns:wps="http://schemas.microsoft.com/office/word/2010/wordprocessingShape" mc:Ignorable="w14 w15 w16se w16cid w16 w16cex w16sdtdh wp14">
+<w:footnotes xmlns:wpc="http://schemas.microsoft.com/office/word/2010/wordprocessingCanvas" xmlns:cx="http://schemas.microsoft.com/office/drawing/2014/chartex" xmlns:cx1="http://schemas.microsoft.com/office/drawing/2015/9/8/chartex" xmlns:cx2="http://schemas.microsoft.com/office/drawing/2015/10/21/chartex" xmlns:cx3="http://schemas.microsoft.com/office/drawing/2016/5/9/chartex" xmlns:cx4="http://schemas.microsoft.com/office/drawing/2016/5/10/chartex" xmlns:cx5="http://schemas.microsoft.com/office/drawing/2016/5/11/chartex" xmlns:cx6="http://schemas.microsoft.com/office/drawing/2016/5/12/chartex" xmlns:cx7="http://schemas.microsoft.com/office/drawing/2016/5/13/chartex" xmlns:cx8="http://schemas.microsoft.com/office/drawing/2016/5/14/chartex" xmlns:mc="http://schemas.openxmlformats.org/markup-compatibility/2006" xmlns:aink="http://schemas.microsoft.com/office/drawing/2016/ink" xmlns:am3d="http://schemas.microsoft.com/office/drawing/2017/model3d" xmlns:o="urn:schemas-microsoft-com:office:office" xmlns:oel="http://schemas.microsoft.com/office/2019/extlst" xmlns:r="http://schemas.openxmlformats.org/officeDocument/2006/relationships" xmlns:m="http://schemas.openxmlformats.org/officeDocument/2006/math" xmlns:v="urn:schemas-microsoft-com:vml" xmlns:wp14="http://schemas.microsoft.com/office/word/2010/wordprocessingDrawing" xmlns:wp="http://schemas.openxmlformats.org/drawingml/2006/wordprocessingDrawing" xmlns:w10="urn:schemas-microsoft-com:office:word" xmlns:w="http://schemas.openxmlformats.org/wordprocessingml/2006/main" xmlns:w14="http://schemas.microsoft.com/office/word/2010/wordml" xmlns:w15="http://schemas.microsoft.com/office/word/2012/wordml" xmlns:w16cex="http://schemas.microsoft.com/office/word/2018/wordml/cex" xmlns:w16cid="http://schemas.microsoft.com/office/word/2016/wordml/cid" xmlns:w16="http://schemas.microsoft.com/office/word/2018/wordml" xmlns:w16du="http://schemas.microsoft.com/office/word/2023/wordml/word16du" xmlns:w16sdtdh="http://schemas.microsoft.com/office/word/2020/wordml/sdtdatahash" xmlns:w16se="http://schemas.microsoft.com/office/word/2015/wordml/symex" xmlns:wpg="http://schemas.microsoft.com/office/word/2010/wordprocessingGroup" xmlns:wpi="http://schemas.microsoft.com/office/word/2010/wordprocessingInk" xmlns:wne="http://schemas.microsoft.com/office/word/2006/wordml" xmlns:wps="http://schemas.microsoft.com/office/word/2010/wordprocessingShape" mc:Ignorable="w14 w15 w16se w16cid w16 w16cex w16sdtdh w16du wp14">
   <w:footnote w:type="separator" w:id="-1">
     <w:p>
       <w:r>
@@ -7194,7 +8179,7 @@
 </file>
 
 <file path=word/numbering.xml><?xml version="1.0" encoding="utf-8"?>
-<w:numbering xmlns:wpc="http://schemas.microsoft.com/office/word/2010/wordprocessingCanvas" xmlns:cx="http://schemas.microsoft.com/office/drawing/2014/chartex" xmlns:cx1="http://schemas.microsoft.com/office/drawing/2015/9/8/chartex" xmlns:cx2="http://schemas.microsoft.com/office/drawing/2015/10/21/chartex" xmlns:cx3="http://schemas.microsoft.com/office/drawing/2016/5/9/chartex" xmlns:cx4="http://schemas.microsoft.com/office/drawing/2016/5/10/chartex" xmlns:cx5="http://schemas.microsoft.com/office/drawing/2016/5/11/chartex" xmlns:cx6="http://schemas.microsoft.com/office/drawing/2016/5/12/chartex" xmlns:cx7="http://schemas.microsoft.com/office/drawing/2016/5/13/chartex" xmlns:cx8="http://schemas.microsoft.com/office/drawing/2016/5/14/chartex" xmlns:mc="http://schemas.openxmlformats.org/markup-compatibility/2006" xmlns:aink="http://schemas.microsoft.com/office/drawing/2016/ink" xmlns:am3d="http://schemas.microsoft.com/office/drawing/2017/model3d" xmlns:o="urn:schemas-microsoft-com:office:office" xmlns:oel="http://schemas.microsoft.com/office/2019/extlst" xmlns:r="http://schemas.openxmlformats.org/officeDocument/2006/relationships" xmlns:m="http://schemas.openxmlformats.org/officeDocument/2006/math" xmlns:v="urn:schemas-microsoft-com:vml" xmlns:wp14="http://schemas.microsoft.com/office/word/2010/wordprocessingDrawing" xmlns:wp="http://schemas.openxmlformats.org/drawingml/2006/wordprocessingDrawing" xmlns:w10="urn:schemas-microsoft-com:office:word" xmlns:w="http://schemas.openxmlformats.org/wordprocessingml/2006/main" xmlns:w14="http://schemas.microsoft.com/office/word/2010/wordml" xmlns:w15="http://schemas.microsoft.com/office/word/2012/wordml" xmlns:w16cex="http://schemas.microsoft.com/office/word/2018/wordml/cex" xmlns:w16cid="http://schemas.microsoft.com/office/word/2016/wordml/cid" xmlns:w16="http://schemas.microsoft.com/office/word/2018/wordml" xmlns:w16sdtdh="http://schemas.microsoft.com/office/word/2020/wordml/sdtdatahash" xmlns:w16se="http://schemas.microsoft.com/office/word/2015/wordml/symex" xmlns:wpg="http://schemas.microsoft.com/office/word/2010/wordprocessingGroup" xmlns:wpi="http://schemas.microsoft.com/office/word/2010/wordprocessingInk" xmlns:wne="http://schemas.microsoft.com/office/word/2006/wordml" xmlns:wps="http://schemas.microsoft.com/office/word/2010/wordprocessingShape" mc:Ignorable="w14 w15 w16se w16cid w16 w16cex w16sdtdh wp14">
+<w:numbering xmlns:wpc="http://schemas.microsoft.com/office/word/2010/wordprocessingCanvas" xmlns:cx="http://schemas.microsoft.com/office/drawing/2014/chartex" xmlns:cx1="http://schemas.microsoft.com/office/drawing/2015/9/8/chartex" xmlns:cx2="http://schemas.microsoft.com/office/drawing/2015/10/21/chartex" xmlns:cx3="http://schemas.microsoft.com/office/drawing/2016/5/9/chartex" xmlns:cx4="http://schemas.microsoft.com/office/drawing/2016/5/10/chartex" xmlns:cx5="http://schemas.microsoft.com/office/drawing/2016/5/11/chartex" xmlns:cx6="http://schemas.microsoft.com/office/drawing/2016/5/12/chartex" xmlns:cx7="http://schemas.microsoft.com/office/drawing/2016/5/13/chartex" xmlns:cx8="http://schemas.microsoft.com/office/drawing/2016/5/14/chartex" xmlns:mc="http://schemas.openxmlformats.org/markup-compatibility/2006" xmlns:aink="http://schemas.microsoft.com/office/drawing/2016/ink" xmlns:am3d="http://schemas.microsoft.com/office/drawing/2017/model3d" xmlns:o="urn:schemas-microsoft-com:office:office" xmlns:oel="http://schemas.microsoft.com/office/2019/extlst" xmlns:r="http://schemas.openxmlformats.org/officeDocument/2006/relationships" xmlns:m="http://schemas.openxmlformats.org/officeDocument/2006/math" xmlns:v="urn:schemas-microsoft-com:vml" xmlns:wp14="http://schemas.microsoft.com/office/word/2010/wordprocessingDrawing" xmlns:wp="http://schemas.openxmlformats.org/drawingml/2006/wordprocessingDrawing" xmlns:w10="urn:schemas-microsoft-com:office:word" xmlns:w="http://schemas.openxmlformats.org/wordprocessingml/2006/main" xmlns:w14="http://schemas.microsoft.com/office/word/2010/wordml" xmlns:w15="http://schemas.microsoft.com/office/word/2012/wordml" xmlns:w16cex="http://schemas.microsoft.com/office/word/2018/wordml/cex" xmlns:w16cid="http://schemas.microsoft.com/office/word/2016/wordml/cid" xmlns:w16="http://schemas.microsoft.com/office/word/2018/wordml" xmlns:w16du="http://schemas.microsoft.com/office/word/2023/wordml/word16du" xmlns:w16sdtdh="http://schemas.microsoft.com/office/word/2020/wordml/sdtdatahash" xmlns:w16se="http://schemas.microsoft.com/office/word/2015/wordml/symex" xmlns:wpg="http://schemas.microsoft.com/office/word/2010/wordprocessingGroup" xmlns:wpi="http://schemas.microsoft.com/office/word/2010/wordprocessingInk" xmlns:wne="http://schemas.microsoft.com/office/word/2006/wordml" xmlns:wps="http://schemas.microsoft.com/office/word/2010/wordprocessingShape" mc:Ignorable="w14 w15 w16se w16cid w16 w16cex w16sdtdh w16du wp14">
   <w:abstractNum w:abstractNumId="0" w15:restartNumberingAfterBreak="0">
     <w:nsid w:val="33310972"/>
     <w:multiLevelType w:val="hybridMultilevel"/>
@@ -8405,7 +9390,7 @@
 </file>
 
 <file path=word/styles.xml><?xml version="1.0" encoding="utf-8"?>
-<w:styles xmlns:mc="http://schemas.openxmlformats.org/markup-compatibility/2006" xmlns:r="http://schemas.openxmlformats.org/officeDocument/2006/relationships" xmlns:w="http://schemas.openxmlformats.org/wordprocessingml/2006/main" xmlns:w14="http://schemas.microsoft.com/office/word/2010/wordml" xmlns:w15="http://schemas.microsoft.com/office/word/2012/wordml" xmlns:w16cex="http://schemas.microsoft.com/office/word/2018/wordml/cex" xmlns:w16cid="http://schemas.microsoft.com/office/word/2016/wordml/cid" xmlns:w16="http://schemas.microsoft.com/office/word/2018/wordml" xmlns:w16sdtdh="http://schemas.microsoft.com/office/word/2020/wordml/sdtdatahash" xmlns:w16se="http://schemas.microsoft.com/office/word/2015/wordml/symex" mc:Ignorable="w14 w15 w16se w16cid w16 w16cex w16sdtdh">
+<w:styles xmlns:mc="http://schemas.openxmlformats.org/markup-compatibility/2006" xmlns:r="http://schemas.openxmlformats.org/officeDocument/2006/relationships" xmlns:w="http://schemas.openxmlformats.org/wordprocessingml/2006/main" xmlns:w14="http://schemas.microsoft.com/office/word/2010/wordml" xmlns:w15="http://schemas.microsoft.com/office/word/2012/wordml" xmlns:w16cex="http://schemas.microsoft.com/office/word/2018/wordml/cex" xmlns:w16cid="http://schemas.microsoft.com/office/word/2016/wordml/cid" xmlns:w16="http://schemas.microsoft.com/office/word/2018/wordml" xmlns:w16du="http://schemas.microsoft.com/office/word/2023/wordml/word16du" xmlns:w16sdtdh="http://schemas.microsoft.com/office/word/2020/wordml/sdtdatahash" xmlns:w16se="http://schemas.microsoft.com/office/word/2015/wordml/symex" mc:Ignorable="w14 w15 w16se w16cid w16 w16cex w16sdtdh w16du">
   <w:docDefaults>
     <w:rPrDefault>
       <w:rPr>

</xml_diff>